<commit_message>
Simplify phase 1 report and workbook layout
</commit_message>
<xml_diff>
--- a/Фаза 1 - Выбор концепции проекта/Фаза 1 Выбор концепции проекта.docx
+++ b/Фаза 1 - Выбор концепции проекта/Фаза 1 Выбор концепции проекта.docx
@@ -7,20 +7,12 @@
         <w:pStyle w:val="Title"/>
       </w:pPr>
       <w:r>
-        <w:t>Фаза 1 Выбор концепции программного проекта</w:t>
+        <w:t>Фаза 1. Выбор концепции проекта</w:t>
       </w:r>
     </w:p>
     <w:p>
       <w:r>
-        <w:t>Четыре концепции сопоставлены методами нечёткого коллективного TOPSIS и чёткого коллективного МАИ. По обоим методам первое место занял сервис регистрации на студенческие события.</w:t>
-      </w:r>
-    </w:p>
-    <w:p>
-      <w:pPr>
-        <w:pStyle w:val="Small"/>
-      </w:pPr>
-      <w:r>
-        <w:t>Эксперты команды: Роман Иванин, Баулин Евгений, Миленин Никита и Соу Мамаду. Расчёт основан на четырёх сценарных профилях M1–M4; приведённые оценки не получены индивидуальным опросом названных участников. Учёт работ вынесен на отдельную доску YouGile.</w:t>
+        <w:t>Команда 19: Роман Иванин, Баулин Евгений, Миленин Никита, Соу Мамаду. Рассмотрены четыре концепции программного проекта. Для сравнения использованы нечёткий коллективный TOPSIS и чёткий коллективный МАИ.</w:t>
       </w:r>
     </w:p>
     <w:p>
@@ -28,7 +20,7 @@
         <w:pStyle w:val="Heading1"/>
       </w:pPr>
       <w:r>
-        <w:t>1 Концепции</w:t>
+        <w:t>Концепции</w:t>
       </w:r>
     </w:p>
     <w:tbl>
@@ -39,22 +31,15 @@
         <w:tblLook w:firstColumn="1" w:firstRow="1" w:lastColumn="0" w:lastRow="0" w:noHBand="0" w:noVBand="1" w:val="04A0"/>
       </w:tblPr>
       <w:tblGrid>
-        <w:gridCol w:w="3312"/>
-        <w:gridCol w:w="3312"/>
-        <w:gridCol w:w="3312"/>
+        <w:gridCol w:w="3175"/>
+        <w:gridCol w:w="3175"/>
+        <w:gridCol w:w="3175"/>
       </w:tblGrid>
       <w:tr>
         <w:tc>
           <w:tcPr>
-            <w:tcW w:type="dxa" w:w="792"/>
-            <w:shd w:fill="E8EDF2"/>
+            <w:tcW w:type="dxa" w:w="680"/>
             <w:vAlign w:val="center"/>
-            <w:tcMar>
-              <w:top w:w="90" w:type="dxa"/>
-              <w:start w:w="110" w:type="dxa"/>
-              <w:bottom w:w="90" w:type="dxa"/>
-              <w:end w:w="110" w:type="dxa"/>
-            </w:tcMar>
           </w:tcPr>
           <w:p>
             <w:pPr>
@@ -62,8 +47,9 @@
             </w:pPr>
             <w:r>
               <w:rPr>
+                <w:rFonts w:ascii="Times New Roman" w:hAnsi="Times New Roman"/>
                 <w:b/>
-                <w:sz w:val="18"/>
+                <w:sz w:val="19"/>
               </w:rPr>
               <w:t>Код</w:t>
             </w:r>
@@ -71,15 +57,8 @@
         </w:tc>
         <w:tc>
           <w:tcPr>
-            <w:tcW w:type="dxa" w:w="2952"/>
-            <w:shd w:fill="E8EDF2"/>
+            <w:tcW w:type="dxa" w:w="3515"/>
             <w:vAlign w:val="center"/>
-            <w:tcMar>
-              <w:top w:w="90" w:type="dxa"/>
-              <w:start w:w="110" w:type="dxa"/>
-              <w:bottom w:w="90" w:type="dxa"/>
-              <w:end w:w="110" w:type="dxa"/>
-            </w:tcMar>
           </w:tcPr>
           <w:p>
             <w:pPr>
@@ -87,8 +66,9 @@
             </w:pPr>
             <w:r>
               <w:rPr>
+                <w:rFonts w:ascii="Times New Roman" w:hAnsi="Times New Roman"/>
                 <w:b/>
-                <w:sz w:val="18"/>
+                <w:sz w:val="19"/>
               </w:rPr>
               <w:t>Концепция</w:t>
             </w:r>
@@ -96,15 +76,8 @@
         </w:tc>
         <w:tc>
           <w:tcPr>
-            <w:tcW w:type="dxa" w:w="6120"/>
-            <w:shd w:fill="E8EDF2"/>
+            <w:tcW w:type="dxa" w:w="5329"/>
             <w:vAlign w:val="center"/>
-            <w:tcMar>
-              <w:top w:w="90" w:type="dxa"/>
-              <w:start w:w="110" w:type="dxa"/>
-              <w:bottom w:w="90" w:type="dxa"/>
-              <w:end w:w="110" w:type="dxa"/>
-            </w:tcMar>
           </w:tcPr>
           <w:p>
             <w:pPr>
@@ -112,10 +85,11 @@
             </w:pPr>
             <w:r>
               <w:rPr>
+                <w:rFonts w:ascii="Times New Roman" w:hAnsi="Times New Roman"/>
                 <w:b/>
-                <w:sz w:val="18"/>
+                <w:sz w:val="19"/>
               </w:rPr>
-              <w:t>Описание и граница MVP</w:t>
+              <w:t>Основной сценарий</w:t>
             </w:r>
           </w:p>
         </w:tc>
@@ -123,14 +97,8 @@
       <w:tr>
         <w:tc>
           <w:tcPr>
-            <w:tcW w:type="dxa" w:w="792"/>
+            <w:tcW w:type="dxa" w:w="680"/>
             <w:vAlign w:val="center"/>
-            <w:tcMar>
-              <w:top w:w="90" w:type="dxa"/>
-              <w:start w:w="110" w:type="dxa"/>
-              <w:bottom w:w="90" w:type="dxa"/>
-              <w:end w:w="110" w:type="dxa"/>
-            </w:tcMar>
           </w:tcPr>
           <w:p>
             <w:pPr>
@@ -138,7 +106,8 @@
             </w:pPr>
             <w:r>
               <w:rPr>
-                <w:sz w:val="18"/>
+                <w:rFonts w:ascii="Times New Roman" w:hAnsi="Times New Roman"/>
+                <w:sz w:val="19"/>
               </w:rPr>
               <w:t>A1</w:t>
             </w:r>
@@ -146,14 +115,8 @@
         </w:tc>
         <w:tc>
           <w:tcPr>
-            <w:tcW w:type="dxa" w:w="2952"/>
+            <w:tcW w:type="dxa" w:w="3515"/>
             <w:vAlign w:val="center"/>
-            <w:tcMar>
-              <w:top w:w="90" w:type="dxa"/>
-              <w:start w:w="110" w:type="dxa"/>
-              <w:bottom w:w="90" w:type="dxa"/>
-              <w:end w:w="110" w:type="dxa"/>
-            </w:tcMar>
           </w:tcPr>
           <w:p>
             <w:pPr>
@@ -161,7 +124,8 @@
             </w:pPr>
             <w:r>
               <w:rPr>
-                <w:sz w:val="18"/>
+                <w:rFonts w:ascii="Times New Roman" w:hAnsi="Times New Roman"/>
+                <w:sz w:val="19"/>
               </w:rPr>
               <w:t>Бронирование учебных помещений</w:t>
             </w:r>
@@ -169,14 +133,8 @@
         </w:tc>
         <w:tc>
           <w:tcPr>
-            <w:tcW w:type="dxa" w:w="6120"/>
+            <w:tcW w:type="dxa" w:w="5329"/>
             <w:vAlign w:val="center"/>
-            <w:tcMar>
-              <w:top w:w="90" w:type="dxa"/>
-              <w:start w:w="110" w:type="dxa"/>
-              <w:bottom w:w="90" w:type="dxa"/>
-              <w:end w:w="110" w:type="dxa"/>
-            </w:tcMar>
           </w:tcPr>
           <w:p>
             <w:pPr>
@@ -184,9 +142,10 @@
             </w:pPr>
             <w:r>
               <w:rPr>
-                <w:sz w:val="18"/>
+                <w:rFonts w:ascii="Times New Roman" w:hAnsi="Times New Roman"/>
+                <w:sz w:val="19"/>
               </w:rPr>
-              <w:t>Веб сервис для поиска свободных аудиторий и записи на групповые занятия. Роли: студент и администратор. Граница MVP: внутренние помещения одного кампуса.</w:t>
+              <w:t>Поиск аудитории и запись на занятие</w:t>
             </w:r>
           </w:p>
         </w:tc>
@@ -194,14 +153,8 @@
       <w:tr>
         <w:tc>
           <w:tcPr>
-            <w:tcW w:type="dxa" w:w="792"/>
+            <w:tcW w:type="dxa" w:w="680"/>
             <w:vAlign w:val="center"/>
-            <w:tcMar>
-              <w:top w:w="90" w:type="dxa"/>
-              <w:start w:w="110" w:type="dxa"/>
-              <w:bottom w:w="90" w:type="dxa"/>
-              <w:end w:w="110" w:type="dxa"/>
-            </w:tcMar>
           </w:tcPr>
           <w:p>
             <w:pPr>
@@ -209,7 +162,8 @@
             </w:pPr>
             <w:r>
               <w:rPr>
-                <w:sz w:val="18"/>
+                <w:rFonts w:ascii="Times New Roman" w:hAnsi="Times New Roman"/>
+                <w:sz w:val="19"/>
               </w:rPr>
               <w:t>A2</w:t>
             </w:r>
@@ -217,14 +171,8 @@
         </w:tc>
         <w:tc>
           <w:tcPr>
-            <w:tcW w:type="dxa" w:w="2952"/>
+            <w:tcW w:type="dxa" w:w="3515"/>
             <w:vAlign w:val="center"/>
-            <w:tcMar>
-              <w:top w:w="90" w:type="dxa"/>
-              <w:start w:w="110" w:type="dxa"/>
-              <w:bottom w:w="90" w:type="dxa"/>
-              <w:end w:w="110" w:type="dxa"/>
-            </w:tcMar>
           </w:tcPr>
           <w:p>
             <w:pPr>
@@ -232,7 +180,8 @@
             </w:pPr>
             <w:r>
               <w:rPr>
-                <w:sz w:val="18"/>
+                <w:rFonts w:ascii="Times New Roman" w:hAnsi="Times New Roman"/>
+                <w:sz w:val="19"/>
               </w:rPr>
               <w:t>Планирование учебных групп</w:t>
             </w:r>
@@ -240,14 +189,8 @@
         </w:tc>
         <w:tc>
           <w:tcPr>
-            <w:tcW w:type="dxa" w:w="6120"/>
+            <w:tcW w:type="dxa" w:w="5329"/>
             <w:vAlign w:val="center"/>
-            <w:tcMar>
-              <w:top w:w="90" w:type="dxa"/>
-              <w:start w:w="110" w:type="dxa"/>
-              <w:bottom w:w="90" w:type="dxa"/>
-              <w:end w:w="110" w:type="dxa"/>
-            </w:tcMar>
           </w:tcPr>
           <w:p>
             <w:pPr>
@@ -255,9 +198,10 @@
             </w:pPr>
             <w:r>
               <w:rPr>
-                <w:sz w:val="18"/>
+                <w:rFonts w:ascii="Times New Roman" w:hAnsi="Times New Roman"/>
+                <w:sz w:val="19"/>
               </w:rPr>
-              <w:t>Веб сервис, где студенты создают группы подготовки, согласуют встречи и ведут общий список тем. Роли: участник и организатор. Граница MVP: один вуз, без видеосвязи.</w:t>
+              <w:t>Создание группы и согласование встреч</w:t>
             </w:r>
           </w:p>
         </w:tc>
@@ -265,14 +209,8 @@
       <w:tr>
         <w:tc>
           <w:tcPr>
-            <w:tcW w:type="dxa" w:w="792"/>
+            <w:tcW w:type="dxa" w:w="680"/>
             <w:vAlign w:val="center"/>
-            <w:tcMar>
-              <w:top w:w="90" w:type="dxa"/>
-              <w:start w:w="110" w:type="dxa"/>
-              <w:bottom w:w="90" w:type="dxa"/>
-              <w:end w:w="110" w:type="dxa"/>
-            </w:tcMar>
           </w:tcPr>
           <w:p>
             <w:pPr>
@@ -280,7 +218,8 @@
             </w:pPr>
             <w:r>
               <w:rPr>
-                <w:sz w:val="18"/>
+                <w:rFonts w:ascii="Times New Roman" w:hAnsi="Times New Roman"/>
+                <w:sz w:val="19"/>
               </w:rPr>
               <w:t>A3</w:t>
             </w:r>
@@ -288,14 +227,8 @@
         </w:tc>
         <w:tc>
           <w:tcPr>
-            <w:tcW w:type="dxa" w:w="2952"/>
+            <w:tcW w:type="dxa" w:w="3515"/>
             <w:vAlign w:val="center"/>
-            <w:tcMar>
-              <w:top w:w="90" w:type="dxa"/>
-              <w:start w:w="110" w:type="dxa"/>
-              <w:bottom w:w="90" w:type="dxa"/>
-              <w:end w:w="110" w:type="dxa"/>
-            </w:tcMar>
           </w:tcPr>
           <w:p>
             <w:pPr>
@@ -303,7 +236,8 @@
             </w:pPr>
             <w:r>
               <w:rPr>
-                <w:sz w:val="18"/>
+                <w:rFonts w:ascii="Times New Roman" w:hAnsi="Times New Roman"/>
+                <w:sz w:val="19"/>
               </w:rPr>
               <w:t>Регистрация на студенческие события</w:t>
             </w:r>
@@ -311,14 +245,8 @@
         </w:tc>
         <w:tc>
           <w:tcPr>
-            <w:tcW w:type="dxa" w:w="6120"/>
+            <w:tcW w:type="dxa" w:w="5329"/>
             <w:vAlign w:val="center"/>
-            <w:tcMar>
-              <w:top w:w="90" w:type="dxa"/>
-              <w:start w:w="110" w:type="dxa"/>
-              <w:bottom w:w="90" w:type="dxa"/>
-              <w:end w:w="110" w:type="dxa"/>
-            </w:tcMar>
           </w:tcPr>
           <w:p>
             <w:pPr>
@@ -326,9 +254,10 @@
             </w:pPr>
             <w:r>
               <w:rPr>
-                <w:sz w:val="18"/>
+                <w:rFonts w:ascii="Times New Roman" w:hAnsi="Times New Roman"/>
+                <w:sz w:val="19"/>
               </w:rPr>
-              <w:t>Веб сервис публикации событий, регистрации участников и учёта посещений. Роли: участник и организатор. Граница MVP: события одного факультета, без платежей.</w:t>
+              <w:t>Публикация событий и запись участников</w:t>
             </w:r>
           </w:p>
         </w:tc>
@@ -336,14 +265,8 @@
       <w:tr>
         <w:tc>
           <w:tcPr>
-            <w:tcW w:type="dxa" w:w="792"/>
+            <w:tcW w:type="dxa" w:w="680"/>
             <w:vAlign w:val="center"/>
-            <w:tcMar>
-              <w:top w:w="90" w:type="dxa"/>
-              <w:start w:w="110" w:type="dxa"/>
-              <w:bottom w:w="90" w:type="dxa"/>
-              <w:end w:w="110" w:type="dxa"/>
-            </w:tcMar>
           </w:tcPr>
           <w:p>
             <w:pPr>
@@ -351,7 +274,8 @@
             </w:pPr>
             <w:r>
               <w:rPr>
-                <w:sz w:val="18"/>
+                <w:rFonts w:ascii="Times New Roman" w:hAnsi="Times New Roman"/>
+                <w:sz w:val="19"/>
               </w:rPr>
               <w:t>A4</w:t>
             </w:r>
@@ -359,14 +283,8 @@
         </w:tc>
         <w:tc>
           <w:tcPr>
-            <w:tcW w:type="dxa" w:w="2952"/>
+            <w:tcW w:type="dxa" w:w="3515"/>
             <w:vAlign w:val="center"/>
-            <w:tcMar>
-              <w:top w:w="90" w:type="dxa"/>
-              <w:start w:w="110" w:type="dxa"/>
-              <w:bottom w:w="90" w:type="dxa"/>
-              <w:end w:w="110" w:type="dxa"/>
-            </w:tcMar>
           </w:tcPr>
           <w:p>
             <w:pPr>
@@ -374,7 +292,8 @@
             </w:pPr>
             <w:r>
               <w:rPr>
-                <w:sz w:val="18"/>
+                <w:rFonts w:ascii="Times New Roman" w:hAnsi="Times New Roman"/>
+                <w:sz w:val="19"/>
               </w:rPr>
               <w:t>Расписание волонтёрских смен</w:t>
             </w:r>
@@ -382,14 +301,8 @@
         </w:tc>
         <w:tc>
           <w:tcPr>
-            <w:tcW w:type="dxa" w:w="6120"/>
+            <w:tcW w:type="dxa" w:w="5329"/>
             <w:vAlign w:val="center"/>
-            <w:tcMar>
-              <w:top w:w="90" w:type="dxa"/>
-              <w:start w:w="110" w:type="dxa"/>
-              <w:bottom w:w="90" w:type="dxa"/>
-              <w:end w:w="110" w:type="dxa"/>
-            </w:tcMar>
           </w:tcPr>
           <w:p>
             <w:pPr>
@@ -397,26 +310,26 @@
             </w:pPr>
             <w:r>
               <w:rPr>
-                <w:sz w:val="18"/>
+                <w:rFonts w:ascii="Times New Roman" w:hAnsi="Times New Roman"/>
+                <w:sz w:val="19"/>
               </w:rPr>
-              <w:t>Веб сервис для публикации смен, записи волонтёров и контроля покрытия. Роли: волонтёр и координатор. Граница MVP: одна организация, без расчёта вознаграждений.</w:t>
+              <w:t>Публикация смен и запись волонтёров</w:t>
             </w:r>
           </w:p>
         </w:tc>
       </w:tr>
     </w:tbl>
-    <w:p/>
     <w:p>
-      <w:r>
-        <w:t>Для каждой концепции можно выделить 10–12 отдельных Use Cases в Фазе 3. Границы MVP включают пользовательские действия, уведомления и административные операции, но исключают платежи, видеосвязь и внешние интеграции.</w:t>
-      </w:r>
+      <w:pPr>
+        <w:spacing w:after="0"/>
+      </w:pPr>
     </w:p>
     <w:p>
       <w:pPr>
         <w:pStyle w:val="Heading1"/>
       </w:pPr>
       <w:r>
-        <w:t>2 Критерии выбора</w:t>
+        <w:t>Критерии</w:t>
       </w:r>
     </w:p>
     <w:tbl>
@@ -427,22 +340,15 @@
         <w:tblLook w:firstColumn="1" w:firstRow="1" w:lastColumn="0" w:lastRow="0" w:noHBand="0" w:noVBand="1" w:val="04A0"/>
       </w:tblPr>
       <w:tblGrid>
-        <w:gridCol w:w="3312"/>
-        <w:gridCol w:w="3312"/>
-        <w:gridCol w:w="3312"/>
+        <w:gridCol w:w="3175"/>
+        <w:gridCol w:w="3175"/>
+        <w:gridCol w:w="3175"/>
       </w:tblGrid>
       <w:tr>
         <w:tc>
           <w:tcPr>
-            <w:tcW w:type="dxa" w:w="792"/>
-            <w:shd w:fill="E8EDF2"/>
+            <w:tcW w:type="dxa" w:w="680"/>
             <w:vAlign w:val="center"/>
-            <w:tcMar>
-              <w:top w:w="90" w:type="dxa"/>
-              <w:start w:w="110" w:type="dxa"/>
-              <w:bottom w:w="90" w:type="dxa"/>
-              <w:end w:w="110" w:type="dxa"/>
-            </w:tcMar>
           </w:tcPr>
           <w:p>
             <w:pPr>
@@ -450,8 +356,9 @@
             </w:pPr>
             <w:r>
               <w:rPr>
+                <w:rFonts w:ascii="Times New Roman" w:hAnsi="Times New Roman"/>
                 <w:b/>
-                <w:sz w:val="18"/>
+                <w:sz w:val="19"/>
               </w:rPr>
               <w:t>Код</w:t>
             </w:r>
@@ -459,15 +366,8 @@
         </w:tc>
         <w:tc>
           <w:tcPr>
-            <w:tcW w:type="dxa" w:w="2520"/>
-            <w:shd w:fill="E8EDF2"/>
+            <w:tcW w:type="dxa" w:w="2494"/>
             <w:vAlign w:val="center"/>
-            <w:tcMar>
-              <w:top w:w="90" w:type="dxa"/>
-              <w:start w:w="110" w:type="dxa"/>
-              <w:bottom w:w="90" w:type="dxa"/>
-              <w:end w:w="110" w:type="dxa"/>
-            </w:tcMar>
           </w:tcPr>
           <w:p>
             <w:pPr>
@@ -475,8 +375,9 @@
             </w:pPr>
             <w:r>
               <w:rPr>
+                <w:rFonts w:ascii="Times New Roman" w:hAnsi="Times New Roman"/>
                 <w:b/>
-                <w:sz w:val="18"/>
+                <w:sz w:val="19"/>
               </w:rPr>
               <w:t>Критерий</w:t>
             </w:r>
@@ -484,15 +385,8 @@
         </w:tc>
         <w:tc>
           <w:tcPr>
-            <w:tcW w:type="dxa" w:w="6552"/>
-            <w:shd w:fill="E8EDF2"/>
+            <w:tcW w:type="dxa" w:w="6350"/>
             <w:vAlign w:val="center"/>
-            <w:tcMar>
-              <w:top w:w="90" w:type="dxa"/>
-              <w:start w:w="110" w:type="dxa"/>
-              <w:bottom w:w="90" w:type="dxa"/>
-              <w:end w:w="110" w:type="dxa"/>
-            </w:tcMar>
           </w:tcPr>
           <w:p>
             <w:pPr>
@@ -500,10 +394,11 @@
             </w:pPr>
             <w:r>
               <w:rPr>
+                <w:rFonts w:ascii="Times New Roman" w:hAnsi="Times New Roman"/>
                 <w:b/>
-                <w:sz w:val="18"/>
+                <w:sz w:val="19"/>
               </w:rPr>
-              <w:t>Операционное толкование</w:t>
+              <w:t>Что оценивается</w:t>
             </w:r>
           </w:p>
         </w:tc>
@@ -511,14 +406,8 @@
       <w:tr>
         <w:tc>
           <w:tcPr>
-            <w:tcW w:type="dxa" w:w="792"/>
+            <w:tcW w:type="dxa" w:w="680"/>
             <w:vAlign w:val="center"/>
-            <w:tcMar>
-              <w:top w:w="90" w:type="dxa"/>
-              <w:start w:w="110" w:type="dxa"/>
-              <w:bottom w:w="90" w:type="dxa"/>
-              <w:end w:w="110" w:type="dxa"/>
-            </w:tcMar>
           </w:tcPr>
           <w:p>
             <w:pPr>
@@ -526,7 +415,8 @@
             </w:pPr>
             <w:r>
               <w:rPr>
-                <w:sz w:val="18"/>
+                <w:rFonts w:ascii="Times New Roman" w:hAnsi="Times New Roman"/>
+                <w:sz w:val="19"/>
               </w:rPr>
               <w:t>C1</w:t>
             </w:r>
@@ -534,14 +424,8 @@
         </w:tc>
         <w:tc>
           <w:tcPr>
-            <w:tcW w:type="dxa" w:w="2520"/>
+            <w:tcW w:type="dxa" w:w="2494"/>
             <w:vAlign w:val="center"/>
-            <w:tcMar>
-              <w:top w:w="90" w:type="dxa"/>
-              <w:start w:w="110" w:type="dxa"/>
-              <w:bottom w:w="90" w:type="dxa"/>
-              <w:end w:w="110" w:type="dxa"/>
-            </w:tcMar>
           </w:tcPr>
           <w:p>
             <w:pPr>
@@ -549,22 +433,17 @@
             </w:pPr>
             <w:r>
               <w:rPr>
-                <w:sz w:val="18"/>
+                <w:rFonts w:ascii="Times New Roman" w:hAnsi="Times New Roman"/>
+                <w:sz w:val="19"/>
               </w:rPr>
-              <w:t>Полезность для целевых пользователей</w:t>
+              <w:t>Полезность</w:t>
             </w:r>
           </w:p>
         </w:tc>
         <w:tc>
           <w:tcPr>
-            <w:tcW w:type="dxa" w:w="6552"/>
+            <w:tcW w:type="dxa" w:w="6350"/>
             <w:vAlign w:val="center"/>
-            <w:tcMar>
-              <w:top w:w="90" w:type="dxa"/>
-              <w:start w:w="110" w:type="dxa"/>
-              <w:bottom w:w="90" w:type="dxa"/>
-              <w:end w:w="110" w:type="dxa"/>
-            </w:tcMar>
           </w:tcPr>
           <w:p>
             <w:pPr>
@@ -572,9 +451,10 @@
             </w:pPr>
             <w:r>
               <w:rPr>
-                <w:sz w:val="18"/>
+                <w:rFonts w:ascii="Times New Roman" w:hAnsi="Times New Roman"/>
+                <w:sz w:val="19"/>
               </w:rPr>
-              <w:t>Насколько концепция решает заметную повседневную задачу. Больше — лучше.</w:t>
+              <w:t>Насколько проект решает задачу пользователя</w:t>
             </w:r>
           </w:p>
         </w:tc>
@@ -582,14 +462,8 @@
       <w:tr>
         <w:tc>
           <w:tcPr>
-            <w:tcW w:type="dxa" w:w="792"/>
+            <w:tcW w:type="dxa" w:w="680"/>
             <w:vAlign w:val="center"/>
-            <w:tcMar>
-              <w:top w:w="90" w:type="dxa"/>
-              <w:start w:w="110" w:type="dxa"/>
-              <w:bottom w:w="90" w:type="dxa"/>
-              <w:end w:w="110" w:type="dxa"/>
-            </w:tcMar>
           </w:tcPr>
           <w:p>
             <w:pPr>
@@ -597,7 +471,8 @@
             </w:pPr>
             <w:r>
               <w:rPr>
-                <w:sz w:val="18"/>
+                <w:rFonts w:ascii="Times New Roman" w:hAnsi="Times New Roman"/>
+                <w:sz w:val="19"/>
               </w:rPr>
               <w:t>C2</w:t>
             </w:r>
@@ -605,14 +480,8 @@
         </w:tc>
         <w:tc>
           <w:tcPr>
-            <w:tcW w:type="dxa" w:w="2520"/>
+            <w:tcW w:type="dxa" w:w="2494"/>
             <w:vAlign w:val="center"/>
-            <w:tcMar>
-              <w:top w:w="90" w:type="dxa"/>
-              <w:start w:w="110" w:type="dxa"/>
-              <w:bottom w:w="90" w:type="dxa"/>
-              <w:end w:w="110" w:type="dxa"/>
-            </w:tcMar>
           </w:tcPr>
           <w:p>
             <w:pPr>
@@ -620,22 +489,17 @@
             </w:pPr>
             <w:r>
               <w:rPr>
-                <w:sz w:val="18"/>
+                <w:rFonts w:ascii="Times New Roman" w:hAnsi="Times New Roman"/>
+                <w:sz w:val="19"/>
               </w:rPr>
-              <w:t>Реализуемость MVP</w:t>
+              <w:t>Реализуемость</w:t>
             </w:r>
           </w:p>
         </w:tc>
         <w:tc>
           <w:tcPr>
-            <w:tcW w:type="dxa" w:w="6552"/>
+            <w:tcW w:type="dxa" w:w="6350"/>
             <w:vAlign w:val="center"/>
-            <w:tcMar>
-              <w:top w:w="90" w:type="dxa"/>
-              <w:start w:w="110" w:type="dxa"/>
-              <w:bottom w:w="90" w:type="dxa"/>
-              <w:end w:w="110" w:type="dxa"/>
-            </w:tcMar>
           </w:tcPr>
           <w:p>
             <w:pPr>
@@ -643,9 +507,10 @@
             </w:pPr>
             <w:r>
               <w:rPr>
-                <w:sz w:val="18"/>
+                <w:rFonts w:ascii="Times New Roman" w:hAnsi="Times New Roman"/>
+                <w:sz w:val="19"/>
               </w:rPr>
-              <w:t>Насколько реально реализовать базовый продукт небольшой учебной командой. Больше — лучше.</w:t>
+              <w:t>Можно ли сделать MVP небольшой командой</w:t>
             </w:r>
           </w:p>
         </w:tc>
@@ -653,14 +518,8 @@
       <w:tr>
         <w:tc>
           <w:tcPr>
-            <w:tcW w:type="dxa" w:w="792"/>
+            <w:tcW w:type="dxa" w:w="680"/>
             <w:vAlign w:val="center"/>
-            <w:tcMar>
-              <w:top w:w="90" w:type="dxa"/>
-              <w:start w:w="110" w:type="dxa"/>
-              <w:bottom w:w="90" w:type="dxa"/>
-              <w:end w:w="110" w:type="dxa"/>
-            </w:tcMar>
           </w:tcPr>
           <w:p>
             <w:pPr>
@@ -668,7 +527,8 @@
             </w:pPr>
             <w:r>
               <w:rPr>
-                <w:sz w:val="18"/>
+                <w:rFonts w:ascii="Times New Roman" w:hAnsi="Times New Roman"/>
+                <w:sz w:val="19"/>
               </w:rPr>
               <w:t>C3</w:t>
             </w:r>
@@ -676,14 +536,8 @@
         </w:tc>
         <w:tc>
           <w:tcPr>
-            <w:tcW w:type="dxa" w:w="2520"/>
+            <w:tcW w:type="dxa" w:w="2494"/>
             <w:vAlign w:val="center"/>
-            <w:tcMar>
-              <w:top w:w="90" w:type="dxa"/>
-              <w:start w:w="110" w:type="dxa"/>
-              <w:bottom w:w="90" w:type="dxa"/>
-              <w:end w:w="110" w:type="dxa"/>
-            </w:tcMar>
           </w:tcPr>
           <w:p>
             <w:pPr>
@@ -691,22 +545,17 @@
             </w:pPr>
             <w:r>
               <w:rPr>
-                <w:sz w:val="18"/>
+                <w:rFonts w:ascii="Times New Roman" w:hAnsi="Times New Roman"/>
+                <w:sz w:val="19"/>
               </w:rPr>
-              <w:t>Ясность границ и сценариев</w:t>
+              <w:t>Ясность сценариев</w:t>
             </w:r>
           </w:p>
         </w:tc>
         <w:tc>
           <w:tcPr>
-            <w:tcW w:type="dxa" w:w="6552"/>
+            <w:tcW w:type="dxa" w:w="6350"/>
             <w:vAlign w:val="center"/>
-            <w:tcMar>
-              <w:top w:w="90" w:type="dxa"/>
-              <w:start w:w="110" w:type="dxa"/>
-              <w:bottom w:w="90" w:type="dxa"/>
-              <w:end w:w="110" w:type="dxa"/>
-            </w:tcMar>
           </w:tcPr>
           <w:p>
             <w:pPr>
@@ -714,9 +563,10 @@
             </w:pPr>
             <w:r>
               <w:rPr>
-                <w:sz w:val="18"/>
+                <w:rFonts w:ascii="Times New Roman" w:hAnsi="Times New Roman"/>
+                <w:sz w:val="19"/>
               </w:rPr>
-              <w:t>Насколько легко выделить 10–15 самостоятельных Use Cases и оценить их в Фазе 3. Больше — лучше.</w:t>
+              <w:t>Можно ли выделить отдельные Use Cases</w:t>
             </w:r>
           </w:p>
         </w:tc>
@@ -724,14 +574,8 @@
       <w:tr>
         <w:tc>
           <w:tcPr>
-            <w:tcW w:type="dxa" w:w="792"/>
+            <w:tcW w:type="dxa" w:w="680"/>
             <w:vAlign w:val="center"/>
-            <w:tcMar>
-              <w:top w:w="90" w:type="dxa"/>
-              <w:start w:w="110" w:type="dxa"/>
-              <w:bottom w:w="90" w:type="dxa"/>
-              <w:end w:w="110" w:type="dxa"/>
-            </w:tcMar>
           </w:tcPr>
           <w:p>
             <w:pPr>
@@ -739,7 +583,8 @@
             </w:pPr>
             <w:r>
               <w:rPr>
-                <w:sz w:val="18"/>
+                <w:rFonts w:ascii="Times New Roman" w:hAnsi="Times New Roman"/>
+                <w:sz w:val="19"/>
               </w:rPr>
               <w:t>C4</w:t>
             </w:r>
@@ -747,14 +592,8 @@
         </w:tc>
         <w:tc>
           <w:tcPr>
-            <w:tcW w:type="dxa" w:w="2520"/>
+            <w:tcW w:type="dxa" w:w="2494"/>
             <w:vAlign w:val="center"/>
-            <w:tcMar>
-              <w:top w:w="90" w:type="dxa"/>
-              <w:start w:w="110" w:type="dxa"/>
-              <w:bottom w:w="90" w:type="dxa"/>
-              <w:end w:w="110" w:type="dxa"/>
-            </w:tcMar>
           </w:tcPr>
           <w:p>
             <w:pPr>
@@ -762,22 +601,17 @@
             </w:pPr>
             <w:r>
               <w:rPr>
-                <w:sz w:val="18"/>
+                <w:rFonts w:ascii="Times New Roman" w:hAnsi="Times New Roman"/>
+                <w:sz w:val="19"/>
               </w:rPr>
-              <w:t>Пригодность для планирования</w:t>
+              <w:t>Планирование</w:t>
             </w:r>
           </w:p>
         </w:tc>
         <w:tc>
           <w:tcPr>
-            <w:tcW w:type="dxa" w:w="6552"/>
+            <w:tcW w:type="dxa" w:w="6350"/>
             <w:vAlign w:val="center"/>
-            <w:tcMar>
-              <w:top w:w="90" w:type="dxa"/>
-              <w:start w:w="110" w:type="dxa"/>
-              <w:bottom w:w="90" w:type="dxa"/>
-              <w:end w:w="110" w:type="dxa"/>
-            </w:tcMar>
           </w:tcPr>
           <w:p>
             <w:pPr>
@@ -785,23 +619,23 @@
             </w:pPr>
             <w:r>
               <w:rPr>
-                <w:sz w:val="18"/>
+                <w:rFonts w:ascii="Times New Roman" w:hAnsi="Times New Roman"/>
+                <w:sz w:val="19"/>
               </w:rPr>
-              <w:t>Насколько естественно разложить проект на 20–25 работ с зависимостями и разными ролями в Фазе 5. Больше — лучше.</w:t>
+              <w:t>Можно ли разделить работу на задачи и роли</w:t>
             </w:r>
           </w:p>
         </w:tc>
       </w:tr>
     </w:tbl>
-    <w:p/>
     <w:p>
-      <w:r>
-        <w:t>Все критерии направлены в одну сторону: более высокая оценка предпочтительнее. Это упрощает нормировку в TOPSIS и не меняет смысл сравнения.</w:t>
-      </w:r>
+      <w:pPr>
+        <w:spacing w:after="0"/>
+      </w:pPr>
     </w:p>
     <w:p>
       <w:r>
-        <w:br w:type="page"/>
+        <w:t>Все критерии выгодные: более высокая оценка считается лучшей.</w:t>
       </w:r>
     </w:p>
     <w:p>
@@ -809,22 +643,22 @@
         <w:pStyle w:val="Heading1"/>
       </w:pPr>
       <w:r>
-        <w:t>3 Модельные оценки</w:t>
+        <w:t>Оценки и расчёт</w:t>
       </w:r>
     </w:p>
     <w:p>
       <w:r>
-        <w:t>Для расчёта заданы четыре различающихся профиля M1–M4: акцент на пользе, запуске, реализуемости и дальнейшем планировании. Каждый профиль имеет собственные оценки важности критериев и альтернатив по шкале 1–9. Для TOPSIS ожидаемое число дополнено осторожной и благоприятной границей: max(1, m−1) ≤ m ≤ min(9, m+1).</w:t>
+        <w:t>Для демонстрации расчёта использованы четыре сценарных набора оценок, соотнесённые с именами членов команды. Индивидуальный опрос участников не проводился. Исходные значения и формулы находятся в книге Excel.</w:t>
       </w:r>
     </w:p>
     <w:p>
       <w:r>
-        <w:t>Для МАИ отдельно заданы профили предпочтений, из которых построены парные сравнения по шкале Саати 1–9 и обратным значениям. Исходные числа и все промежуточные расчёты приведены на листах книги «Фаза 1 Экспертные оценки.xlsx».</w:t>
+        <w:t>В TOPSIS оценки записаны тройками: осторожное, ожидаемое и благоприятное значения. После усреднения оценок и нормировки найдено расстояние каждой концепции до лучшего и худшего решений. Чем выше коэффициент близости CC = D− / (D+ + D−), тем выше место.</w:t>
       </w:r>
     </w:p>
     <w:p>
       <w:r>
-        <w:t>Фактический состав команды — четыре человека. В исходном тексте задания указана группа из трёх человек.</w:t>
+        <w:t>В МАИ составлены парные сравнения критериев и альтернатив. Мнения объединены геометрическим средним, после чего вычислены веса критериев и общий приоритет каждой концепции. Отношения согласованности CR для всех групповых матриц ниже 0,10.</w:t>
       </w:r>
     </w:p>
     <w:p>
@@ -832,56 +666,7 @@
         <w:pStyle w:val="Heading1"/>
       </w:pPr>
       <w:r>
-        <w:t>4 Метод расчёта</w:t>
-      </w:r>
-    </w:p>
-    <w:p>
-      <w:pPr>
-        <w:pStyle w:val="Heading2"/>
-      </w:pPr>
-      <w:r>
-        <w:t>Нечёткий коллективный TOPSIS</w:t>
-      </w:r>
-    </w:p>
-    <w:p>
-      <w:r>
-        <w:t>Три числа каждой оценки образуют треугольное нечёткое число (l, m, u). По каждому элементу берётся покомпонентное среднее оценок экспертов. Оценки альтернатив нормируются по максимальной верхней границе соответствующего критерия. Веса критериев нормируются по сумме их верхних границ. Нормированные оценки покомпонентно умножаются на веса.</w:t>
-      </w:r>
-    </w:p>
-    <w:p>
-      <w:r>
-        <w:t>Для каждого критерия положительный идеал — покомпонентный максимум взвешенных оценок четырёх концепций, отрицательный — покомпонентный минимум. Расстояние между двумя тройками вычисляется как корень из среднего квадратов трёх разностей. Для каждой концепции суммируются расстояния до двух идеалов; коэффициент близости CC = D− / (D+ + D−). Предпочтителен наибольший CC. Все критерии являются выгодными.</w:t>
-      </w:r>
-    </w:p>
-    <w:p>
-      <w:pPr>
-        <w:pStyle w:val="Heading2"/>
-      </w:pPr>
-      <w:r>
-        <w:t>Чёткий коллективный МАИ</w:t>
-      </w:r>
-    </w:p>
-    <w:p>
-      <w:r>
-        <w:t>Из каждой экспертной анкеты составляются взаимно обратные матрицы парных сравнений: одна 4 × 4 для критериев и четыре 4 × 4 для концепций по отдельным критериям. Групповая оценка каждой пары — геометрическое среднее индивидуальных суждений. Вектор приоритетов каждой групповой матрицы находится методом геометрических средних строк и нормируется до суммы 1. Общий приоритет концепции — сумма её локальных приоритетов, умноженных на веса критериев.</w:t>
-      </w:r>
-    </w:p>
-    <w:p>
-      <w:r>
-        <w:t>Для каждой матрицы вычислена согласованность: λmax = среднее (Aw)i/wi, CI = (λmax−4)/3, CR = CI/0,90. Во всех пяти групповых матрицах CR меньше порогового значения 0,10. Максимальный общий приоритет определяет первое место по МАИ.</w:t>
-      </w:r>
-    </w:p>
-    <w:p>
-      <w:r>
-        <w:br w:type="page"/>
-      </w:r>
-    </w:p>
-    <w:p>
-      <w:pPr>
-        <w:pStyle w:val="Heading1"/>
-      </w:pPr>
-      <w:r>
-        <w:t>5 Результаты сравнения</w:t>
+        <w:t>Результат</w:t>
       </w:r>
     </w:p>
     <w:tbl>
@@ -892,24 +677,16 @@
         <w:tblLook w:firstColumn="1" w:firstRow="1" w:lastColumn="0" w:lastRow="0" w:noHBand="0" w:noVBand="1" w:val="04A0"/>
       </w:tblPr>
       <w:tblGrid>
-        <w:gridCol w:w="1987"/>
-        <w:gridCol w:w="1987"/>
-        <w:gridCol w:w="1987"/>
-        <w:gridCol w:w="1987"/>
-        <w:gridCol w:w="1987"/>
+        <w:gridCol w:w="2381"/>
+        <w:gridCol w:w="2381"/>
+        <w:gridCol w:w="2381"/>
+        <w:gridCol w:w="2381"/>
       </w:tblGrid>
       <w:tr>
         <w:tc>
           <w:tcPr>
-            <w:tcW w:type="dxa" w:w="3960"/>
-            <w:shd w:fill="E8EDF2"/>
+            <w:tcW w:type="dxa" w:w="5102"/>
             <w:vAlign w:val="center"/>
-            <w:tcMar>
-              <w:top w:w="90" w:type="dxa"/>
-              <w:start w:w="110" w:type="dxa"/>
-              <w:bottom w:w="90" w:type="dxa"/>
-              <w:end w:w="110" w:type="dxa"/>
-            </w:tcMar>
           </w:tcPr>
           <w:p>
             <w:pPr>
@@ -917,8 +694,9 @@
             </w:pPr>
             <w:r>
               <w:rPr>
+                <w:rFonts w:ascii="Times New Roman" w:hAnsi="Times New Roman"/>
                 <w:b/>
-                <w:sz w:val="18"/>
+                <w:sz w:val="19"/>
               </w:rPr>
               <w:t>Концепция</w:t>
             </w:r>
@@ -926,15 +704,8 @@
         </w:tc>
         <w:tc>
           <w:tcPr>
-            <w:tcW w:type="dxa" w:w="1440"/>
-            <w:shd w:fill="E8EDF2"/>
+            <w:tcW w:type="dxa" w:w="1531"/>
             <w:vAlign w:val="center"/>
-            <w:tcMar>
-              <w:top w:w="90" w:type="dxa"/>
-              <w:start w:w="110" w:type="dxa"/>
-              <w:bottom w:w="90" w:type="dxa"/>
-              <w:end w:w="110" w:type="dxa"/>
-            </w:tcMar>
           </w:tcPr>
           <w:p>
             <w:pPr>
@@ -942,24 +713,18 @@
             </w:pPr>
             <w:r>
               <w:rPr>
+                <w:rFonts w:ascii="Times New Roman" w:hAnsi="Times New Roman"/>
                 <w:b/>
-                <w:sz w:val="18"/>
+                <w:sz w:val="19"/>
               </w:rPr>
-              <w:t>CC TOPSIS</w:t>
+              <w:t>TOPSIS: CC</w:t>
             </w:r>
           </w:p>
         </w:tc>
         <w:tc>
           <w:tcPr>
-            <w:tcW w:type="dxa" w:w="1440"/>
-            <w:shd w:fill="E8EDF2"/>
+            <w:tcW w:type="dxa" w:w="1531"/>
             <w:vAlign w:val="center"/>
-            <w:tcMar>
-              <w:top w:w="90" w:type="dxa"/>
-              <w:start w:w="110" w:type="dxa"/>
-              <w:bottom w:w="90" w:type="dxa"/>
-              <w:end w:w="110" w:type="dxa"/>
-            </w:tcMar>
           </w:tcPr>
           <w:p>
             <w:pPr>
@@ -967,24 +732,18 @@
             </w:pPr>
             <w:r>
               <w:rPr>
+                <w:rFonts w:ascii="Times New Roman" w:hAnsi="Times New Roman"/>
                 <w:b/>
-                <w:sz w:val="18"/>
+                <w:sz w:val="19"/>
               </w:rPr>
-              <w:t>Место TOPSIS</w:t>
+              <w:t>МАИ: вес</w:t>
             </w:r>
           </w:p>
         </w:tc>
         <w:tc>
           <w:tcPr>
-            <w:tcW w:type="dxa" w:w="1584"/>
-            <w:shd w:fill="E8EDF2"/>
+            <w:tcW w:type="dxa" w:w="1361"/>
             <w:vAlign w:val="center"/>
-            <w:tcMar>
-              <w:top w:w="90" w:type="dxa"/>
-              <w:start w:w="110" w:type="dxa"/>
-              <w:bottom w:w="90" w:type="dxa"/>
-              <w:end w:w="110" w:type="dxa"/>
-            </w:tcMar>
           </w:tcPr>
           <w:p>
             <w:pPr>
@@ -992,24 +751,20 @@
             </w:pPr>
             <w:r>
               <w:rPr>
+                <w:rFonts w:ascii="Times New Roman" w:hAnsi="Times New Roman"/>
                 <w:b/>
-                <w:sz w:val="18"/>
+                <w:sz w:val="19"/>
               </w:rPr>
-              <w:t>Приоритет МАИ</w:t>
+              <w:t>Место</w:t>
             </w:r>
           </w:p>
         </w:tc>
+      </w:tr>
+      <w:tr>
         <w:tc>
           <w:tcPr>
-            <w:tcW w:type="dxa" w:w="1440"/>
-            <w:shd w:fill="E8EDF2"/>
+            <w:tcW w:type="dxa" w:w="5102"/>
             <w:vAlign w:val="center"/>
-            <w:tcMar>
-              <w:top w:w="90" w:type="dxa"/>
-              <w:start w:w="110" w:type="dxa"/>
-              <w:bottom w:w="90" w:type="dxa"/>
-              <w:end w:w="110" w:type="dxa"/>
-            </w:tcMar>
           </w:tcPr>
           <w:p>
             <w:pPr>
@@ -1017,25 +772,17 @@
             </w:pPr>
             <w:r>
               <w:rPr>
-                <w:b/>
-                <w:sz w:val="18"/>
+                <w:rFonts w:ascii="Times New Roman" w:hAnsi="Times New Roman"/>
+                <w:sz w:val="19"/>
               </w:rPr>
-              <w:t>Место МАИ</w:t>
+              <w:t>A1 Бронирование учебных помещений</w:t>
             </w:r>
           </w:p>
         </w:tc>
-      </w:tr>
-      <w:tr>
         <w:tc>
           <w:tcPr>
-            <w:tcW w:type="dxa" w:w="3960"/>
+            <w:tcW w:type="dxa" w:w="1531"/>
             <w:vAlign w:val="center"/>
-            <w:tcMar>
-              <w:top w:w="90" w:type="dxa"/>
-              <w:start w:w="110" w:type="dxa"/>
-              <w:bottom w:w="90" w:type="dxa"/>
-              <w:end w:w="110" w:type="dxa"/>
-            </w:tcMar>
           </w:tcPr>
           <w:p>
             <w:pPr>
@@ -1043,22 +790,17 @@
             </w:pPr>
             <w:r>
               <w:rPr>
-                <w:sz w:val="18"/>
+                <w:rFonts w:ascii="Times New Roman" w:hAnsi="Times New Roman"/>
+                <w:sz w:val="19"/>
               </w:rPr>
-              <w:t>A1 Бронирование учебных помещений</w:t>
+              <w:t>0,3160</w:t>
             </w:r>
           </w:p>
         </w:tc>
         <w:tc>
           <w:tcPr>
-            <w:tcW w:type="dxa" w:w="1440"/>
+            <w:tcW w:type="dxa" w:w="1531"/>
             <w:vAlign w:val="center"/>
-            <w:tcMar>
-              <w:top w:w="90" w:type="dxa"/>
-              <w:start w:w="110" w:type="dxa"/>
-              <w:bottom w:w="90" w:type="dxa"/>
-              <w:end w:w="110" w:type="dxa"/>
-            </w:tcMar>
           </w:tcPr>
           <w:p>
             <w:pPr>
@@ -1066,22 +808,17 @@
             </w:pPr>
             <w:r>
               <w:rPr>
-                <w:sz w:val="18"/>
+                <w:rFonts w:ascii="Times New Roman" w:hAnsi="Times New Roman"/>
+                <w:sz w:val="19"/>
               </w:rPr>
-              <w:t>0.3160</w:t>
+              <w:t>0,2094</w:t>
             </w:r>
           </w:p>
         </w:tc>
         <w:tc>
           <w:tcPr>
-            <w:tcW w:type="dxa" w:w="1440"/>
+            <w:tcW w:type="dxa" w:w="1361"/>
             <w:vAlign w:val="center"/>
-            <w:tcMar>
-              <w:top w:w="90" w:type="dxa"/>
-              <w:start w:w="110" w:type="dxa"/>
-              <w:bottom w:w="90" w:type="dxa"/>
-              <w:end w:w="110" w:type="dxa"/>
-            </w:tcMar>
           </w:tcPr>
           <w:p>
             <w:pPr>
@@ -1089,53 +826,8 @@
             </w:pPr>
             <w:r>
               <w:rPr>
-                <w:sz w:val="18"/>
-              </w:rPr>
-              <w:t>4</w:t>
-            </w:r>
-          </w:p>
-        </w:tc>
-        <w:tc>
-          <w:tcPr>
-            <w:tcW w:type="dxa" w:w="1584"/>
-            <w:vAlign w:val="center"/>
-            <w:tcMar>
-              <w:top w:w="90" w:type="dxa"/>
-              <w:start w:w="110" w:type="dxa"/>
-              <w:bottom w:w="90" w:type="dxa"/>
-              <w:end w:w="110" w:type="dxa"/>
-            </w:tcMar>
-          </w:tcPr>
-          <w:p>
-            <w:pPr>
-              <w:spacing w:after="0"/>
-            </w:pPr>
-            <w:r>
-              <w:rPr>
-                <w:sz w:val="18"/>
-              </w:rPr>
-              <w:t>0.2094</w:t>
-            </w:r>
-          </w:p>
-        </w:tc>
-        <w:tc>
-          <w:tcPr>
-            <w:tcW w:type="dxa" w:w="1440"/>
-            <w:vAlign w:val="center"/>
-            <w:tcMar>
-              <w:top w:w="90" w:type="dxa"/>
-              <w:start w:w="110" w:type="dxa"/>
-              <w:bottom w:w="90" w:type="dxa"/>
-              <w:end w:w="110" w:type="dxa"/>
-            </w:tcMar>
-          </w:tcPr>
-          <w:p>
-            <w:pPr>
-              <w:spacing w:after="0"/>
-            </w:pPr>
-            <w:r>
-              <w:rPr>
-                <w:sz w:val="18"/>
+                <w:rFonts w:ascii="Times New Roman" w:hAnsi="Times New Roman"/>
+                <w:sz w:val="19"/>
               </w:rPr>
               <w:t>4</w:t>
             </w:r>
@@ -1145,14 +837,8 @@
       <w:tr>
         <w:tc>
           <w:tcPr>
-            <w:tcW w:type="dxa" w:w="3960"/>
+            <w:tcW w:type="dxa" w:w="5102"/>
             <w:vAlign w:val="center"/>
-            <w:tcMar>
-              <w:top w:w="90" w:type="dxa"/>
-              <w:start w:w="110" w:type="dxa"/>
-              <w:bottom w:w="90" w:type="dxa"/>
-              <w:end w:w="110" w:type="dxa"/>
-            </w:tcMar>
           </w:tcPr>
           <w:p>
             <w:pPr>
@@ -1160,7 +846,8 @@
             </w:pPr>
             <w:r>
               <w:rPr>
-                <w:sz w:val="18"/>
+                <w:rFonts w:ascii="Times New Roman" w:hAnsi="Times New Roman"/>
+                <w:sz w:val="19"/>
               </w:rPr>
               <w:t>A2 Планирование учебных групп</w:t>
             </w:r>
@@ -1168,14 +855,8 @@
         </w:tc>
         <w:tc>
           <w:tcPr>
-            <w:tcW w:type="dxa" w:w="1440"/>
+            <w:tcW w:type="dxa" w:w="1531"/>
             <w:vAlign w:val="center"/>
-            <w:tcMar>
-              <w:top w:w="90" w:type="dxa"/>
-              <w:start w:w="110" w:type="dxa"/>
-              <w:bottom w:w="90" w:type="dxa"/>
-              <w:end w:w="110" w:type="dxa"/>
-            </w:tcMar>
           </w:tcPr>
           <w:p>
             <w:pPr>
@@ -1183,22 +864,17 @@
             </w:pPr>
             <w:r>
               <w:rPr>
-                <w:sz w:val="18"/>
+                <w:rFonts w:ascii="Times New Roman" w:hAnsi="Times New Roman"/>
+                <w:sz w:val="19"/>
               </w:rPr>
-              <w:t>0.3987</w:t>
+              <w:t>0,3987</w:t>
             </w:r>
           </w:p>
         </w:tc>
         <w:tc>
           <w:tcPr>
-            <w:tcW w:type="dxa" w:w="1440"/>
+            <w:tcW w:type="dxa" w:w="1531"/>
             <w:vAlign w:val="center"/>
-            <w:tcMar>
-              <w:top w:w="90" w:type="dxa"/>
-              <w:start w:w="110" w:type="dxa"/>
-              <w:bottom w:w="90" w:type="dxa"/>
-              <w:end w:w="110" w:type="dxa"/>
-            </w:tcMar>
           </w:tcPr>
           <w:p>
             <w:pPr>
@@ -1206,22 +882,17 @@
             </w:pPr>
             <w:r>
               <w:rPr>
-                <w:sz w:val="18"/>
+                <w:rFonts w:ascii="Times New Roman" w:hAnsi="Times New Roman"/>
+                <w:sz w:val="19"/>
               </w:rPr>
-              <w:t>3</w:t>
+              <w:t>0,2278</w:t>
             </w:r>
           </w:p>
         </w:tc>
         <w:tc>
           <w:tcPr>
-            <w:tcW w:type="dxa" w:w="1584"/>
+            <w:tcW w:type="dxa" w:w="1361"/>
             <w:vAlign w:val="center"/>
-            <w:tcMar>
-              <w:top w:w="90" w:type="dxa"/>
-              <w:start w:w="110" w:type="dxa"/>
-              <w:bottom w:w="90" w:type="dxa"/>
-              <w:end w:w="110" w:type="dxa"/>
-            </w:tcMar>
           </w:tcPr>
           <w:p>
             <w:pPr>
@@ -1229,30 +900,8 @@
             </w:pPr>
             <w:r>
               <w:rPr>
-                <w:sz w:val="18"/>
-              </w:rPr>
-              <w:t>0.2278</w:t>
-            </w:r>
-          </w:p>
-        </w:tc>
-        <w:tc>
-          <w:tcPr>
-            <w:tcW w:type="dxa" w:w="1440"/>
-            <w:vAlign w:val="center"/>
-            <w:tcMar>
-              <w:top w:w="90" w:type="dxa"/>
-              <w:start w:w="110" w:type="dxa"/>
-              <w:bottom w:w="90" w:type="dxa"/>
-              <w:end w:w="110" w:type="dxa"/>
-            </w:tcMar>
-          </w:tcPr>
-          <w:p>
-            <w:pPr>
-              <w:spacing w:after="0"/>
-            </w:pPr>
-            <w:r>
-              <w:rPr>
-                <w:sz w:val="18"/>
+                <w:rFonts w:ascii="Times New Roman" w:hAnsi="Times New Roman"/>
+                <w:sz w:val="19"/>
               </w:rPr>
               <w:t>3</w:t>
             </w:r>
@@ -1262,14 +911,8 @@
       <w:tr>
         <w:tc>
           <w:tcPr>
-            <w:tcW w:type="dxa" w:w="3960"/>
+            <w:tcW w:type="dxa" w:w="5102"/>
             <w:vAlign w:val="center"/>
-            <w:tcMar>
-              <w:top w:w="90" w:type="dxa"/>
-              <w:start w:w="110" w:type="dxa"/>
-              <w:bottom w:w="90" w:type="dxa"/>
-              <w:end w:w="110" w:type="dxa"/>
-            </w:tcMar>
           </w:tcPr>
           <w:p>
             <w:pPr>
@@ -1277,7 +920,8 @@
             </w:pPr>
             <w:r>
               <w:rPr>
-                <w:sz w:val="18"/>
+                <w:rFonts w:ascii="Times New Roman" w:hAnsi="Times New Roman"/>
+                <w:sz w:val="19"/>
               </w:rPr>
               <w:t>A3 Регистрация на студенческие события</w:t>
             </w:r>
@@ -1285,14 +929,8 @@
         </w:tc>
         <w:tc>
           <w:tcPr>
-            <w:tcW w:type="dxa" w:w="1440"/>
+            <w:tcW w:type="dxa" w:w="1531"/>
             <w:vAlign w:val="center"/>
-            <w:tcMar>
-              <w:top w:w="90" w:type="dxa"/>
-              <w:start w:w="110" w:type="dxa"/>
-              <w:bottom w:w="90" w:type="dxa"/>
-              <w:end w:w="110" w:type="dxa"/>
-            </w:tcMar>
           </w:tcPr>
           <w:p>
             <w:pPr>
@@ -1300,22 +938,17 @@
             </w:pPr>
             <w:r>
               <w:rPr>
-                <w:sz w:val="18"/>
+                <w:rFonts w:ascii="Times New Roman" w:hAnsi="Times New Roman"/>
+                <w:sz w:val="19"/>
               </w:rPr>
-              <w:t>0.8228</w:t>
+              <w:t>0,8228</w:t>
             </w:r>
           </w:p>
         </w:tc>
         <w:tc>
           <w:tcPr>
-            <w:tcW w:type="dxa" w:w="1440"/>
+            <w:tcW w:type="dxa" w:w="1531"/>
             <w:vAlign w:val="center"/>
-            <w:tcMar>
-              <w:top w:w="90" w:type="dxa"/>
-              <w:start w:w="110" w:type="dxa"/>
-              <w:bottom w:w="90" w:type="dxa"/>
-              <w:end w:w="110" w:type="dxa"/>
-            </w:tcMar>
           </w:tcPr>
           <w:p>
             <w:pPr>
@@ -1323,22 +956,17 @@
             </w:pPr>
             <w:r>
               <w:rPr>
-                <w:sz w:val="18"/>
+                <w:rFonts w:ascii="Times New Roman" w:hAnsi="Times New Roman"/>
+                <w:sz w:val="19"/>
               </w:rPr>
-              <w:t>1</w:t>
+              <w:t>0,3012</w:t>
             </w:r>
           </w:p>
         </w:tc>
         <w:tc>
           <w:tcPr>
-            <w:tcW w:type="dxa" w:w="1584"/>
+            <w:tcW w:type="dxa" w:w="1361"/>
             <w:vAlign w:val="center"/>
-            <w:tcMar>
-              <w:top w:w="90" w:type="dxa"/>
-              <w:start w:w="110" w:type="dxa"/>
-              <w:bottom w:w="90" w:type="dxa"/>
-              <w:end w:w="110" w:type="dxa"/>
-            </w:tcMar>
           </w:tcPr>
           <w:p>
             <w:pPr>
@@ -1346,30 +974,8 @@
             </w:pPr>
             <w:r>
               <w:rPr>
-                <w:sz w:val="18"/>
-              </w:rPr>
-              <w:t>0.3012</w:t>
-            </w:r>
-          </w:p>
-        </w:tc>
-        <w:tc>
-          <w:tcPr>
-            <w:tcW w:type="dxa" w:w="1440"/>
-            <w:vAlign w:val="center"/>
-            <w:tcMar>
-              <w:top w:w="90" w:type="dxa"/>
-              <w:start w:w="110" w:type="dxa"/>
-              <w:bottom w:w="90" w:type="dxa"/>
-              <w:end w:w="110" w:type="dxa"/>
-            </w:tcMar>
-          </w:tcPr>
-          <w:p>
-            <w:pPr>
-              <w:spacing w:after="0"/>
-            </w:pPr>
-            <w:r>
-              <w:rPr>
-                <w:sz w:val="18"/>
+                <w:rFonts w:ascii="Times New Roman" w:hAnsi="Times New Roman"/>
+                <w:sz w:val="19"/>
               </w:rPr>
               <w:t>1</w:t>
             </w:r>
@@ -1379,14 +985,8 @@
       <w:tr>
         <w:tc>
           <w:tcPr>
-            <w:tcW w:type="dxa" w:w="3960"/>
+            <w:tcW w:type="dxa" w:w="5102"/>
             <w:vAlign w:val="center"/>
-            <w:tcMar>
-              <w:top w:w="90" w:type="dxa"/>
-              <w:start w:w="110" w:type="dxa"/>
-              <w:bottom w:w="90" w:type="dxa"/>
-              <w:end w:w="110" w:type="dxa"/>
-            </w:tcMar>
           </w:tcPr>
           <w:p>
             <w:pPr>
@@ -1394,7 +994,8 @@
             </w:pPr>
             <w:r>
               <w:rPr>
-                <w:sz w:val="18"/>
+                <w:rFonts w:ascii="Times New Roman" w:hAnsi="Times New Roman"/>
+                <w:sz w:val="19"/>
               </w:rPr>
               <w:t>A4 Расписание волонтёрских смен</w:t>
             </w:r>
@@ -1402,14 +1003,8 @@
         </w:tc>
         <w:tc>
           <w:tcPr>
-            <w:tcW w:type="dxa" w:w="1440"/>
+            <w:tcW w:type="dxa" w:w="1531"/>
             <w:vAlign w:val="center"/>
-            <w:tcMar>
-              <w:top w:w="90" w:type="dxa"/>
-              <w:start w:w="110" w:type="dxa"/>
-              <w:bottom w:w="90" w:type="dxa"/>
-              <w:end w:w="110" w:type="dxa"/>
-            </w:tcMar>
           </w:tcPr>
           <w:p>
             <w:pPr>
@@ -1417,22 +1012,17 @@
             </w:pPr>
             <w:r>
               <w:rPr>
-                <w:sz w:val="18"/>
+                <w:rFonts w:ascii="Times New Roman" w:hAnsi="Times New Roman"/>
+                <w:sz w:val="19"/>
               </w:rPr>
-              <w:t>0.5794</w:t>
+              <w:t>0,5794</w:t>
             </w:r>
           </w:p>
         </w:tc>
         <w:tc>
           <w:tcPr>
-            <w:tcW w:type="dxa" w:w="1440"/>
+            <w:tcW w:type="dxa" w:w="1531"/>
             <w:vAlign w:val="center"/>
-            <w:tcMar>
-              <w:top w:w="90" w:type="dxa"/>
-              <w:start w:w="110" w:type="dxa"/>
-              <w:bottom w:w="90" w:type="dxa"/>
-              <w:end w:w="110" w:type="dxa"/>
-            </w:tcMar>
           </w:tcPr>
           <w:p>
             <w:pPr>
@@ -1440,22 +1030,17 @@
             </w:pPr>
             <w:r>
               <w:rPr>
-                <w:sz w:val="18"/>
+                <w:rFonts w:ascii="Times New Roman" w:hAnsi="Times New Roman"/>
+                <w:sz w:val="19"/>
               </w:rPr>
-              <w:t>2</w:t>
+              <w:t>0,2616</w:t>
             </w:r>
           </w:p>
         </w:tc>
         <w:tc>
           <w:tcPr>
-            <w:tcW w:type="dxa" w:w="1584"/>
+            <w:tcW w:type="dxa" w:w="1361"/>
             <w:vAlign w:val="center"/>
-            <w:tcMar>
-              <w:top w:w="90" w:type="dxa"/>
-              <w:start w:w="110" w:type="dxa"/>
-              <w:bottom w:w="90" w:type="dxa"/>
-              <w:end w:w="110" w:type="dxa"/>
-            </w:tcMar>
           </w:tcPr>
           <w:p>
             <w:pPr>
@@ -1463,30 +1048,8 @@
             </w:pPr>
             <w:r>
               <w:rPr>
-                <w:sz w:val="18"/>
-              </w:rPr>
-              <w:t>0.2616</w:t>
-            </w:r>
-          </w:p>
-        </w:tc>
-        <w:tc>
-          <w:tcPr>
-            <w:tcW w:type="dxa" w:w="1440"/>
-            <w:vAlign w:val="center"/>
-            <w:tcMar>
-              <w:top w:w="90" w:type="dxa"/>
-              <w:start w:w="110" w:type="dxa"/>
-              <w:bottom w:w="90" w:type="dxa"/>
-              <w:end w:w="110" w:type="dxa"/>
-            </w:tcMar>
-          </w:tcPr>
-          <w:p>
-            <w:pPr>
-              <w:spacing w:after="0"/>
-            </w:pPr>
-            <w:r>
-              <w:rPr>
-                <w:sz w:val="18"/>
+                <w:rFonts w:ascii="Times New Roman" w:hAnsi="Times New Roman"/>
+                <w:sz w:val="19"/>
               </w:rPr>
               <w:t>2</w:t>
             </w:r>
@@ -1494,20 +1057,19 @@
         </w:tc>
       </w:tr>
     </w:tbl>
-    <w:p/>
+    <w:p>
+      <w:pPr>
+        <w:spacing w:after="0"/>
+      </w:pPr>
+    </w:p>
     <w:p>
       <w:r>
-        <w:t>По обоим методам первое место заняла A3 «Регистрация на студенческие события». TOPSIS: CC = 0,8228; МАИ: приоритет = 0,3012. Далее следуют A4, A2 и A1. У A3 высокий баланс по четырём критериям; A2 сильнее по реализуемости, A4 — по пригодности для планирования.</w:t>
+        <w:t>Оба метода дали одинаковый порядок: A3, A4, A2, A1. Для дальнейшей работы выбрана A3 — регистрация на студенческие события. Результат относится к заданным сценарным оценкам.</w:t>
       </w:r>
     </w:p>
     <w:p>
       <w:r>
-        <w:t>Согласованность групповых матриц МАИ: CR критериев = 0,0014; CR матриц альтернатив по C1–C4 = 0,0111; 0,0115; 0,0040; 0,0095. Все значения ниже порога 0,10. Исключение по одному из четырёх модельных профилей не меняет порядок альтернатив ни в одном из двух методов.</w:t>
-      </w:r>
-    </w:p>
-    <w:p>
-      <w:r>
-        <w:t>Полученный порядок относится к заданным сценарным оценкам. Коэффициенты TOPSIS и приоритеты МАИ имеют разные шкалы и сопоставляются по порядку альтернатив, а не по абсолютной величине.</w:t>
+        <w:t>Задачи команды ведутся на отдельной доске YouGile: https://ru.yougile.com/board/nb0783gl8x30.</w:t>
       </w:r>
     </w:p>
     <w:p>
@@ -1515,64 +1077,27 @@
         <w:pStyle w:val="Heading1"/>
       </w:pPr>
       <w:r>
-        <w:t>6 Учёт работ</w:t>
+        <w:t>Литература</w:t>
       </w:r>
     </w:p>
     <w:p>
       <w:r>
-        <w:t>Учёт задач, исполнителей, периодов и чистого времени работы вынесен на отдельную доску YouGile: https://ru.yougile.com/board/nb0783gl8x30. Материалы таск-трекера в данном репозитории не дублируются.</w:t>
+        <w:t>Chen C.-T. Extensions of the TOPSIS for group decision-making under fuzzy environment. Fuzzy Sets and Systems, 2000. DOI: 10.1016/S0165-0114(97)00377-1.</w:t>
       </w:r>
     </w:p>
     <w:p>
-      <w:pPr>
-        <w:pStyle w:val="Heading1"/>
-      </w:pPr>
       <w:r>
-        <w:t>Источники метода</w:t>
-      </w:r>
-    </w:p>
-    <w:p>
-      <w:pPr>
-        <w:pStyle w:val="Small"/>
-      </w:pPr>
-      <w:r>
-        <w:t>Chen C.-T. Extensions of the TOPSIS for group decision-making under fuzzy environment. Fuzzy Sets and Systems, 2000. DOI: 10.1016/S0165-0114(97)00377-1. https://www.sciencedirect.com/science/article/pii/S0165011497003771</w:t>
-      </w:r>
-    </w:p>
-    <w:p>
-      <w:pPr>
-        <w:pStyle w:val="Small"/>
-      </w:pPr>
-      <w:r>
-        <w:t>Ramanathan R., Ganesh L. S. Group preference aggregation methods employed in AHP. European Journal of Operational Research, 1994. DOI: 10.1016/0377-2217(94)90356-5. https://www.sciencedirect.com/science/article/pii/0377221794903565</w:t>
+        <w:t>Ramanathan R., Ganesh L. S. Group preference aggregation methods employed in AHP. European Journal of Operational Research, 1994. DOI: 10.1016/0377-2217(94)90356-5.</w:t>
       </w:r>
     </w:p>
     <w:sectPr>
-      <w:footerReference w:type="default" r:id="rId9"/>
-      <w:pgSz w:w="12240" w:h="15840"/>
-      <w:pgMar w:top="1008" w:right="1152" w:bottom="936" w:left="1152" w:header="720" w:footer="720" w:gutter="0"/>
+      <w:pgSz w:w="11906" w:h="16838"/>
+      <w:pgMar w:top="1134" w:right="1134" w:bottom="1134" w:left="1247" w:header="720" w:footer="720" w:gutter="0"/>
       <w:cols w:space="720"/>
       <w:docGrid w:linePitch="360"/>
     </w:sectPr>
   </w:body>
 </w:document>
-</file>
-
-<file path=word/footer1.xml><?xml version="1.0" encoding="utf-8"?>
-<w:ftr xmlns:m="http://schemas.openxmlformats.org/officeDocument/2006/math" xmlns:mc="http://schemas.openxmlformats.org/markup-compatibility/2006" xmlns:mo="http://schemas.microsoft.com/office/mac/office/2008/main" xmlns:mv="urn:schemas-microsoft-com:mac:vml" xmlns:o="urn:schemas-microsoft-com:office:office" xmlns:r="http://schemas.openxmlformats.org/officeDocument/2006/relationships" xmlns:v="urn:schemas-microsoft-com:vml" xmlns:w10="urn:schemas-microsoft-com:office:word" xmlns:w14="http://schemas.microsoft.com/office/word/2010/wordml" xmlns:w="http://schemas.openxmlformats.org/wordprocessingml/2006/main" xmlns:wne="http://schemas.microsoft.com/office/word/2006/wordml" xmlns:wp14="http://schemas.microsoft.com/office/word/2010/wordprocessingDrawing" xmlns:wp="http://schemas.openxmlformats.org/drawingml/2006/wordprocessingDrawing" xmlns:wpc="http://schemas.microsoft.com/office/word/2010/wordprocessingCanvas" xmlns:wpg="http://schemas.microsoft.com/office/word/2010/wordprocessingGroup" xmlns:wpi="http://schemas.microsoft.com/office/word/2010/wordprocessingInk" xmlns:wps="http://schemas.microsoft.com/office/word/2010/wordprocessingShape" mc:Ignorable="w14 wp14">
-  <w:p>
-    <w:pPr>
-      <w:pStyle w:val="Footer"/>
-      <w:jc w:val="right"/>
-    </w:pPr>
-    <w:r>
-      <w:rPr>
-        <w:sz w:val="16"/>
-      </w:rPr>
-      <w:t>Фаза 1 • Отчёт</w:t>
-    </w:r>
-  </w:p>
-</w:ftr>
 </file>
 
 <file path=word/numbering.xml><?xml version="1.0" encoding="utf-8"?>
@@ -1939,12 +1464,11 @@
     <w:qFormat/>
     <w:rsid w:val="00FC693F"/>
     <w:pPr>
-      <w:spacing w:after="120"/>
+      <w:spacing w:after="100" w:line="259" w:lineRule="auto"/>
     </w:pPr>
     <w:rPr>
-      <w:rFonts w:ascii="Aptos" w:hAnsi="Aptos"/>
-      <w:color w:val="000000"/>
-      <w:sz w:val="21"/>
+      <w:rFonts w:ascii="Times New Roman" w:hAnsi="Times New Roman"/>
+      <w:sz w:val="22"/>
     </w:rPr>
   </w:style>
   <w:style w:type="paragraph" w:styleId="Header">
@@ -2002,15 +1526,14 @@
     <w:pPr>
       <w:keepNext/>
       <w:keepLines/>
-      <w:spacing w:before="160" w:after="100"/>
+      <w:spacing w:before="200" w:after="80"/>
       <w:outlineLvl w:val="0"/>
     </w:pPr>
     <w:rPr>
-      <w:rFonts w:asciiTheme="majorHAnsi" w:eastAsiaTheme="majorEastAsia" w:hAnsiTheme="majorHAnsi" w:cstheme="majorBidi" w:ascii="Aptos" w:hAnsi="Aptos"/>
+      <w:rFonts w:asciiTheme="majorHAnsi" w:eastAsiaTheme="majorEastAsia" w:hAnsiTheme="majorHAnsi" w:cstheme="majorBidi" w:ascii="Times New Roman" w:hAnsi="Times New Roman"/>
       <w:b/>
       <w:bCs/>
-      <w:color w:val="000000"/>
-      <w:sz w:val="26"/>
+      <w:sz w:val="24"/>
       <w:szCs w:val="28"/>
     </w:rPr>
   </w:style>
@@ -2026,15 +1549,15 @@
     <w:pPr>
       <w:keepNext/>
       <w:keepLines/>
-      <w:spacing w:before="120" w:after="100"/>
+      <w:spacing w:before="200" w:after="0"/>
       <w:outlineLvl w:val="1"/>
     </w:pPr>
     <w:rPr>
-      <w:rFonts w:asciiTheme="majorHAnsi" w:eastAsiaTheme="majorEastAsia" w:hAnsiTheme="majorHAnsi" w:cstheme="majorBidi" w:ascii="Aptos" w:hAnsi="Aptos"/>
+      <w:rFonts w:asciiTheme="majorHAnsi" w:eastAsiaTheme="majorEastAsia" w:hAnsiTheme="majorHAnsi" w:cstheme="majorBidi"/>
       <w:b/>
       <w:bCs/>
-      <w:color w:val="000000"/>
-      <w:sz w:val="22"/>
+      <w:color w:val="4F81BD" w:themeColor="accent1"/>
+      <w:sz w:val="26"/>
       <w:szCs w:val="26"/>
     </w:rPr>
   </w:style>
@@ -2288,16 +1811,15 @@
     <w:qFormat/>
     <w:rsid w:val="00FC693F"/>
     <w:pPr>
-      <w:spacing w:after="100" w:line="240" w:lineRule="auto" w:before="240"/>
+      <w:spacing w:after="80" w:line="240" w:lineRule="auto" w:before="200"/>
       <w:contextualSpacing/>
     </w:pPr>
     <w:rPr>
-      <w:rFonts w:asciiTheme="majorHAnsi" w:eastAsiaTheme="majorEastAsia" w:hAnsiTheme="majorHAnsi" w:cstheme="majorBidi" w:ascii="Aptos" w:hAnsi="Aptos"/>
+      <w:rFonts w:asciiTheme="majorHAnsi" w:eastAsiaTheme="majorEastAsia" w:hAnsiTheme="majorHAnsi" w:cstheme="majorBidi" w:ascii="Times New Roman" w:hAnsi="Times New Roman"/>
       <w:b/>
-      <w:color w:val="000000"/>
       <w:spacing w:val="5"/>
       <w:kern w:val="28"/>
-      <w:sz w:val="36"/>
+      <w:sz w:val="28"/>
       <w:szCs w:val="52"/>
     </w:rPr>
   </w:style>
@@ -13626,13 +13148,6 @@
         <w:shd w:val="clear" w:color="auto" w:fill="FBCAA2" w:themeFill="accent6" w:themeFillTint="7F"/>
       </w:tcPr>
     </w:tblStylePr>
-  </w:style>
-  <w:style w:type="paragraph" w:customStyle="1" w:styleId="Small">
-    <w:name w:val="Small"/>
-    <w:rPr>
-      <w:rFonts w:ascii="Aptos" w:hAnsi="Aptos"/>
-      <w:sz w:val="18"/>
-    </w:rPr>
   </w:style>
 </w:styles>
 </file>

</xml_diff>

<commit_message>
Remove explanatory notes from phase 1 materials
</commit_message>
<xml_diff>
--- a/Фаза 1 - Выбор концепции проекта/Фаза 1 Выбор концепции проекта.docx
+++ b/Фаза 1 - Выбор концепции проекта/Фаза 1 Выбор концепции проекта.docx
@@ -648,7 +648,7 @@
     </w:p>
     <w:p>
       <w:r>
-        <w:t>Для демонстрации расчёта использованы четыре сценарных набора оценок, соотнесённые с именами членов команды. Индивидуальный опрос участников не проводился. Исходные значения и формулы находятся в книге Excel.</w:t>
+        <w:t>Исходные оценки и промежуточные формулы приведены в книге Excel. На отдельных листах показаны расчёты TOPSIS и МАИ.</w:t>
       </w:r>
     </w:p>
     <w:p>
@@ -1064,7 +1064,7 @@
     </w:p>
     <w:p>
       <w:r>
-        <w:t>Оба метода дали одинаковый порядок: A3, A4, A2, A1. Для дальнейшей работы выбрана A3 — регистрация на студенческие события. Результат относится к заданным сценарным оценкам.</w:t>
+        <w:t>Оба метода дали одинаковый порядок: A3, A4, A2, A1. Для дальнейшей работы выбрана A3 — регистрация на студенческие события.</w:t>
       </w:r>
     </w:p>
     <w:p>

</xml_diff>

<commit_message>
Restore detailed phase 1 report without references
</commit_message>
<xml_diff>
--- a/Фаза 1 - Выбор концепции проекта/Фаза 1 Выбор концепции проекта.docx
+++ b/Фаза 1 - Выбор концепции проекта/Фаза 1 Выбор концепции проекта.docx
@@ -7,12 +7,20 @@
         <w:pStyle w:val="Title"/>
       </w:pPr>
       <w:r>
-        <w:t>Фаза 1. Выбор концепции проекта</w:t>
+        <w:t>Фаза 1 Выбор концепции программного проекта</w:t>
       </w:r>
     </w:p>
     <w:p>
       <w:r>
-        <w:t>Команда 19: Роман Иванин, Баулин Евгений, Миленин Никита, Соу Мамаду. Рассмотрены четыре концепции программного проекта. Для сравнения использованы нечёткий коллективный TOPSIS и чёткий коллективный МАИ.</w:t>
+        <w:t>Четыре концепции сопоставлены методами нечёткого коллективного TOPSIS и чёткого коллективного МАИ. По обоим методам первое место занял сервис регистрации на студенческие события.</w:t>
+      </w:r>
+    </w:p>
+    <w:p>
+      <w:pPr>
+        <w:pStyle w:val="Small"/>
+      </w:pPr>
+      <w:r>
+        <w:t>Эксперты команды: Роман Иванин, Баулин Евгений, Миленин Никита и Соу Мамаду. Учёт работ вынесен на отдельную доску YouGile.</w:t>
       </w:r>
     </w:p>
     <w:p>
@@ -20,7 +28,7 @@
         <w:pStyle w:val="Heading1"/>
       </w:pPr>
       <w:r>
-        <w:t>Концепции</w:t>
+        <w:t>1 Концепции</w:t>
       </w:r>
     </w:p>
     <w:tbl>
@@ -31,15 +39,22 @@
         <w:tblLook w:firstColumn="1" w:firstRow="1" w:lastColumn="0" w:lastRow="0" w:noHBand="0" w:noVBand="1" w:val="04A0"/>
       </w:tblPr>
       <w:tblGrid>
-        <w:gridCol w:w="3175"/>
-        <w:gridCol w:w="3175"/>
-        <w:gridCol w:w="3175"/>
+        <w:gridCol w:w="3312"/>
+        <w:gridCol w:w="3312"/>
+        <w:gridCol w:w="3312"/>
       </w:tblGrid>
       <w:tr>
         <w:tc>
           <w:tcPr>
-            <w:tcW w:type="dxa" w:w="680"/>
+            <w:tcW w:type="dxa" w:w="792"/>
+            <w:shd w:fill="E8EDF2"/>
             <w:vAlign w:val="center"/>
+            <w:tcMar>
+              <w:top w:w="90" w:type="dxa"/>
+              <w:start w:w="110" w:type="dxa"/>
+              <w:bottom w:w="90" w:type="dxa"/>
+              <w:end w:w="110" w:type="dxa"/>
+            </w:tcMar>
           </w:tcPr>
           <w:p>
             <w:pPr>
@@ -47,9 +62,8 @@
             </w:pPr>
             <w:r>
               <w:rPr>
-                <w:rFonts w:ascii="Times New Roman" w:hAnsi="Times New Roman"/>
                 <w:b/>
-                <w:sz w:val="19"/>
+                <w:sz w:val="18"/>
               </w:rPr>
               <w:t>Код</w:t>
             </w:r>
@@ -57,8 +71,15 @@
         </w:tc>
         <w:tc>
           <w:tcPr>
-            <w:tcW w:type="dxa" w:w="3515"/>
+            <w:tcW w:type="dxa" w:w="2952"/>
+            <w:shd w:fill="E8EDF2"/>
             <w:vAlign w:val="center"/>
+            <w:tcMar>
+              <w:top w:w="90" w:type="dxa"/>
+              <w:start w:w="110" w:type="dxa"/>
+              <w:bottom w:w="90" w:type="dxa"/>
+              <w:end w:w="110" w:type="dxa"/>
+            </w:tcMar>
           </w:tcPr>
           <w:p>
             <w:pPr>
@@ -66,9 +87,8 @@
             </w:pPr>
             <w:r>
               <w:rPr>
-                <w:rFonts w:ascii="Times New Roman" w:hAnsi="Times New Roman"/>
                 <w:b/>
-                <w:sz w:val="19"/>
+                <w:sz w:val="18"/>
               </w:rPr>
               <w:t>Концепция</w:t>
             </w:r>
@@ -76,8 +96,15 @@
         </w:tc>
         <w:tc>
           <w:tcPr>
-            <w:tcW w:type="dxa" w:w="5329"/>
+            <w:tcW w:type="dxa" w:w="6120"/>
+            <w:shd w:fill="E8EDF2"/>
             <w:vAlign w:val="center"/>
+            <w:tcMar>
+              <w:top w:w="90" w:type="dxa"/>
+              <w:start w:w="110" w:type="dxa"/>
+              <w:bottom w:w="90" w:type="dxa"/>
+              <w:end w:w="110" w:type="dxa"/>
+            </w:tcMar>
           </w:tcPr>
           <w:p>
             <w:pPr>
@@ -85,11 +112,10 @@
             </w:pPr>
             <w:r>
               <w:rPr>
-                <w:rFonts w:ascii="Times New Roman" w:hAnsi="Times New Roman"/>
                 <w:b/>
-                <w:sz w:val="19"/>
+                <w:sz w:val="18"/>
               </w:rPr>
-              <w:t>Основной сценарий</w:t>
+              <w:t>Описание и граница MVP</w:t>
             </w:r>
           </w:p>
         </w:tc>
@@ -97,8 +123,14 @@
       <w:tr>
         <w:tc>
           <w:tcPr>
-            <w:tcW w:type="dxa" w:w="680"/>
+            <w:tcW w:type="dxa" w:w="792"/>
             <w:vAlign w:val="center"/>
+            <w:tcMar>
+              <w:top w:w="90" w:type="dxa"/>
+              <w:start w:w="110" w:type="dxa"/>
+              <w:bottom w:w="90" w:type="dxa"/>
+              <w:end w:w="110" w:type="dxa"/>
+            </w:tcMar>
           </w:tcPr>
           <w:p>
             <w:pPr>
@@ -106,8 +138,7 @@
             </w:pPr>
             <w:r>
               <w:rPr>
-                <w:rFonts w:ascii="Times New Roman" w:hAnsi="Times New Roman"/>
-                <w:sz w:val="19"/>
+                <w:sz w:val="18"/>
               </w:rPr>
               <w:t>A1</w:t>
             </w:r>
@@ -115,8 +146,14 @@
         </w:tc>
         <w:tc>
           <w:tcPr>
-            <w:tcW w:type="dxa" w:w="3515"/>
+            <w:tcW w:type="dxa" w:w="2952"/>
             <w:vAlign w:val="center"/>
+            <w:tcMar>
+              <w:top w:w="90" w:type="dxa"/>
+              <w:start w:w="110" w:type="dxa"/>
+              <w:bottom w:w="90" w:type="dxa"/>
+              <w:end w:w="110" w:type="dxa"/>
+            </w:tcMar>
           </w:tcPr>
           <w:p>
             <w:pPr>
@@ -124,8 +161,7 @@
             </w:pPr>
             <w:r>
               <w:rPr>
-                <w:rFonts w:ascii="Times New Roman" w:hAnsi="Times New Roman"/>
-                <w:sz w:val="19"/>
+                <w:sz w:val="18"/>
               </w:rPr>
               <w:t>Бронирование учебных помещений</w:t>
             </w:r>
@@ -133,8 +169,14 @@
         </w:tc>
         <w:tc>
           <w:tcPr>
-            <w:tcW w:type="dxa" w:w="5329"/>
+            <w:tcW w:type="dxa" w:w="6120"/>
             <w:vAlign w:val="center"/>
+            <w:tcMar>
+              <w:top w:w="90" w:type="dxa"/>
+              <w:start w:w="110" w:type="dxa"/>
+              <w:bottom w:w="90" w:type="dxa"/>
+              <w:end w:w="110" w:type="dxa"/>
+            </w:tcMar>
           </w:tcPr>
           <w:p>
             <w:pPr>
@@ -142,10 +184,9 @@
             </w:pPr>
             <w:r>
               <w:rPr>
-                <w:rFonts w:ascii="Times New Roman" w:hAnsi="Times New Roman"/>
-                <w:sz w:val="19"/>
+                <w:sz w:val="18"/>
               </w:rPr>
-              <w:t>Поиск аудитории и запись на занятие</w:t>
+              <w:t>Веб сервис для поиска свободных аудиторий и записи на групповые занятия. Роли: студент и администратор. Граница MVP: внутренние помещения одного кампуса.</w:t>
             </w:r>
           </w:p>
         </w:tc>
@@ -153,8 +194,14 @@
       <w:tr>
         <w:tc>
           <w:tcPr>
-            <w:tcW w:type="dxa" w:w="680"/>
+            <w:tcW w:type="dxa" w:w="792"/>
             <w:vAlign w:val="center"/>
+            <w:tcMar>
+              <w:top w:w="90" w:type="dxa"/>
+              <w:start w:w="110" w:type="dxa"/>
+              <w:bottom w:w="90" w:type="dxa"/>
+              <w:end w:w="110" w:type="dxa"/>
+            </w:tcMar>
           </w:tcPr>
           <w:p>
             <w:pPr>
@@ -162,8 +209,7 @@
             </w:pPr>
             <w:r>
               <w:rPr>
-                <w:rFonts w:ascii="Times New Roman" w:hAnsi="Times New Roman"/>
-                <w:sz w:val="19"/>
+                <w:sz w:val="18"/>
               </w:rPr>
               <w:t>A2</w:t>
             </w:r>
@@ -171,8 +217,14 @@
         </w:tc>
         <w:tc>
           <w:tcPr>
-            <w:tcW w:type="dxa" w:w="3515"/>
+            <w:tcW w:type="dxa" w:w="2952"/>
             <w:vAlign w:val="center"/>
+            <w:tcMar>
+              <w:top w:w="90" w:type="dxa"/>
+              <w:start w:w="110" w:type="dxa"/>
+              <w:bottom w:w="90" w:type="dxa"/>
+              <w:end w:w="110" w:type="dxa"/>
+            </w:tcMar>
           </w:tcPr>
           <w:p>
             <w:pPr>
@@ -180,8 +232,7 @@
             </w:pPr>
             <w:r>
               <w:rPr>
-                <w:rFonts w:ascii="Times New Roman" w:hAnsi="Times New Roman"/>
-                <w:sz w:val="19"/>
+                <w:sz w:val="18"/>
               </w:rPr>
               <w:t>Планирование учебных групп</w:t>
             </w:r>
@@ -189,8 +240,14 @@
         </w:tc>
         <w:tc>
           <w:tcPr>
-            <w:tcW w:type="dxa" w:w="5329"/>
+            <w:tcW w:type="dxa" w:w="6120"/>
             <w:vAlign w:val="center"/>
+            <w:tcMar>
+              <w:top w:w="90" w:type="dxa"/>
+              <w:start w:w="110" w:type="dxa"/>
+              <w:bottom w:w="90" w:type="dxa"/>
+              <w:end w:w="110" w:type="dxa"/>
+            </w:tcMar>
           </w:tcPr>
           <w:p>
             <w:pPr>
@@ -198,10 +255,9 @@
             </w:pPr>
             <w:r>
               <w:rPr>
-                <w:rFonts w:ascii="Times New Roman" w:hAnsi="Times New Roman"/>
-                <w:sz w:val="19"/>
+                <w:sz w:val="18"/>
               </w:rPr>
-              <w:t>Создание группы и согласование встреч</w:t>
+              <w:t>Веб сервис, где студенты создают группы подготовки, согласуют встречи и ведут общий список тем. Роли: участник и организатор. Граница MVP: один вуз, без видеосвязи.</w:t>
             </w:r>
           </w:p>
         </w:tc>
@@ -209,8 +265,14 @@
       <w:tr>
         <w:tc>
           <w:tcPr>
-            <w:tcW w:type="dxa" w:w="680"/>
+            <w:tcW w:type="dxa" w:w="792"/>
             <w:vAlign w:val="center"/>
+            <w:tcMar>
+              <w:top w:w="90" w:type="dxa"/>
+              <w:start w:w="110" w:type="dxa"/>
+              <w:bottom w:w="90" w:type="dxa"/>
+              <w:end w:w="110" w:type="dxa"/>
+            </w:tcMar>
           </w:tcPr>
           <w:p>
             <w:pPr>
@@ -218,8 +280,7 @@
             </w:pPr>
             <w:r>
               <w:rPr>
-                <w:rFonts w:ascii="Times New Roman" w:hAnsi="Times New Roman"/>
-                <w:sz w:val="19"/>
+                <w:sz w:val="18"/>
               </w:rPr>
               <w:t>A3</w:t>
             </w:r>
@@ -227,8 +288,14 @@
         </w:tc>
         <w:tc>
           <w:tcPr>
-            <w:tcW w:type="dxa" w:w="3515"/>
+            <w:tcW w:type="dxa" w:w="2952"/>
             <w:vAlign w:val="center"/>
+            <w:tcMar>
+              <w:top w:w="90" w:type="dxa"/>
+              <w:start w:w="110" w:type="dxa"/>
+              <w:bottom w:w="90" w:type="dxa"/>
+              <w:end w:w="110" w:type="dxa"/>
+            </w:tcMar>
           </w:tcPr>
           <w:p>
             <w:pPr>
@@ -236,8 +303,7 @@
             </w:pPr>
             <w:r>
               <w:rPr>
-                <w:rFonts w:ascii="Times New Roman" w:hAnsi="Times New Roman"/>
-                <w:sz w:val="19"/>
+                <w:sz w:val="18"/>
               </w:rPr>
               <w:t>Регистрация на студенческие события</w:t>
             </w:r>
@@ -245,8 +311,14 @@
         </w:tc>
         <w:tc>
           <w:tcPr>
-            <w:tcW w:type="dxa" w:w="5329"/>
+            <w:tcW w:type="dxa" w:w="6120"/>
             <w:vAlign w:val="center"/>
+            <w:tcMar>
+              <w:top w:w="90" w:type="dxa"/>
+              <w:start w:w="110" w:type="dxa"/>
+              <w:bottom w:w="90" w:type="dxa"/>
+              <w:end w:w="110" w:type="dxa"/>
+            </w:tcMar>
           </w:tcPr>
           <w:p>
             <w:pPr>
@@ -254,10 +326,9 @@
             </w:pPr>
             <w:r>
               <w:rPr>
-                <w:rFonts w:ascii="Times New Roman" w:hAnsi="Times New Roman"/>
-                <w:sz w:val="19"/>
+                <w:sz w:val="18"/>
               </w:rPr>
-              <w:t>Публикация событий и запись участников</w:t>
+              <w:t>Веб сервис публикации событий, регистрации участников и учёта посещений. Роли: участник и организатор. Граница MVP: события одного факультета, без платежей.</w:t>
             </w:r>
           </w:p>
         </w:tc>
@@ -265,8 +336,14 @@
       <w:tr>
         <w:tc>
           <w:tcPr>
-            <w:tcW w:type="dxa" w:w="680"/>
+            <w:tcW w:type="dxa" w:w="792"/>
             <w:vAlign w:val="center"/>
+            <w:tcMar>
+              <w:top w:w="90" w:type="dxa"/>
+              <w:start w:w="110" w:type="dxa"/>
+              <w:bottom w:w="90" w:type="dxa"/>
+              <w:end w:w="110" w:type="dxa"/>
+            </w:tcMar>
           </w:tcPr>
           <w:p>
             <w:pPr>
@@ -274,8 +351,7 @@
             </w:pPr>
             <w:r>
               <w:rPr>
-                <w:rFonts w:ascii="Times New Roman" w:hAnsi="Times New Roman"/>
-                <w:sz w:val="19"/>
+                <w:sz w:val="18"/>
               </w:rPr>
               <w:t>A4</w:t>
             </w:r>
@@ -283,8 +359,14 @@
         </w:tc>
         <w:tc>
           <w:tcPr>
-            <w:tcW w:type="dxa" w:w="3515"/>
+            <w:tcW w:type="dxa" w:w="2952"/>
             <w:vAlign w:val="center"/>
+            <w:tcMar>
+              <w:top w:w="90" w:type="dxa"/>
+              <w:start w:w="110" w:type="dxa"/>
+              <w:bottom w:w="90" w:type="dxa"/>
+              <w:end w:w="110" w:type="dxa"/>
+            </w:tcMar>
           </w:tcPr>
           <w:p>
             <w:pPr>
@@ -292,8 +374,7 @@
             </w:pPr>
             <w:r>
               <w:rPr>
-                <w:rFonts w:ascii="Times New Roman" w:hAnsi="Times New Roman"/>
-                <w:sz w:val="19"/>
+                <w:sz w:val="18"/>
               </w:rPr>
               <w:t>Расписание волонтёрских смен</w:t>
             </w:r>
@@ -301,8 +382,14 @@
         </w:tc>
         <w:tc>
           <w:tcPr>
-            <w:tcW w:type="dxa" w:w="5329"/>
+            <w:tcW w:type="dxa" w:w="6120"/>
             <w:vAlign w:val="center"/>
+            <w:tcMar>
+              <w:top w:w="90" w:type="dxa"/>
+              <w:start w:w="110" w:type="dxa"/>
+              <w:bottom w:w="90" w:type="dxa"/>
+              <w:end w:w="110" w:type="dxa"/>
+            </w:tcMar>
           </w:tcPr>
           <w:p>
             <w:pPr>
@@ -310,26 +397,26 @@
             </w:pPr>
             <w:r>
               <w:rPr>
-                <w:rFonts w:ascii="Times New Roman" w:hAnsi="Times New Roman"/>
-                <w:sz w:val="19"/>
+                <w:sz w:val="18"/>
               </w:rPr>
-              <w:t>Публикация смен и запись волонтёров</w:t>
+              <w:t>Веб сервис для публикации смен, записи волонтёров и контроля покрытия. Роли: волонтёр и координатор. Граница MVP: одна организация, без расчёта вознаграждений.</w:t>
             </w:r>
           </w:p>
         </w:tc>
       </w:tr>
     </w:tbl>
+    <w:p/>
     <w:p>
-      <w:pPr>
-        <w:spacing w:after="0"/>
-      </w:pPr>
+      <w:r>
+        <w:t>Для каждой концепции можно выделить 10–12 отдельных Use Cases в Фазе 3. Границы MVP включают пользовательские действия, уведомления и административные операции, но исключают платежи, видеосвязь и внешние интеграции.</w:t>
+      </w:r>
     </w:p>
     <w:p>
       <w:pPr>
         <w:pStyle w:val="Heading1"/>
       </w:pPr>
       <w:r>
-        <w:t>Критерии</w:t>
+        <w:t>2 Критерии выбора</w:t>
       </w:r>
     </w:p>
     <w:tbl>
@@ -340,15 +427,22 @@
         <w:tblLook w:firstColumn="1" w:firstRow="1" w:lastColumn="0" w:lastRow="0" w:noHBand="0" w:noVBand="1" w:val="04A0"/>
       </w:tblPr>
       <w:tblGrid>
-        <w:gridCol w:w="3175"/>
-        <w:gridCol w:w="3175"/>
-        <w:gridCol w:w="3175"/>
+        <w:gridCol w:w="3312"/>
+        <w:gridCol w:w="3312"/>
+        <w:gridCol w:w="3312"/>
       </w:tblGrid>
       <w:tr>
         <w:tc>
           <w:tcPr>
-            <w:tcW w:type="dxa" w:w="680"/>
+            <w:tcW w:type="dxa" w:w="792"/>
+            <w:shd w:fill="E8EDF2"/>
             <w:vAlign w:val="center"/>
+            <w:tcMar>
+              <w:top w:w="90" w:type="dxa"/>
+              <w:start w:w="110" w:type="dxa"/>
+              <w:bottom w:w="90" w:type="dxa"/>
+              <w:end w:w="110" w:type="dxa"/>
+            </w:tcMar>
           </w:tcPr>
           <w:p>
             <w:pPr>
@@ -356,9 +450,8 @@
             </w:pPr>
             <w:r>
               <w:rPr>
-                <w:rFonts w:ascii="Times New Roman" w:hAnsi="Times New Roman"/>
                 <w:b/>
-                <w:sz w:val="19"/>
+                <w:sz w:val="18"/>
               </w:rPr>
               <w:t>Код</w:t>
             </w:r>
@@ -366,8 +459,15 @@
         </w:tc>
         <w:tc>
           <w:tcPr>
-            <w:tcW w:type="dxa" w:w="2494"/>
+            <w:tcW w:type="dxa" w:w="2520"/>
+            <w:shd w:fill="E8EDF2"/>
             <w:vAlign w:val="center"/>
+            <w:tcMar>
+              <w:top w:w="90" w:type="dxa"/>
+              <w:start w:w="110" w:type="dxa"/>
+              <w:bottom w:w="90" w:type="dxa"/>
+              <w:end w:w="110" w:type="dxa"/>
+            </w:tcMar>
           </w:tcPr>
           <w:p>
             <w:pPr>
@@ -375,9 +475,8 @@
             </w:pPr>
             <w:r>
               <w:rPr>
-                <w:rFonts w:ascii="Times New Roman" w:hAnsi="Times New Roman"/>
                 <w:b/>
-                <w:sz w:val="19"/>
+                <w:sz w:val="18"/>
               </w:rPr>
               <w:t>Критерий</w:t>
             </w:r>
@@ -385,8 +484,15 @@
         </w:tc>
         <w:tc>
           <w:tcPr>
-            <w:tcW w:type="dxa" w:w="6350"/>
+            <w:tcW w:type="dxa" w:w="6552"/>
+            <w:shd w:fill="E8EDF2"/>
             <w:vAlign w:val="center"/>
+            <w:tcMar>
+              <w:top w:w="90" w:type="dxa"/>
+              <w:start w:w="110" w:type="dxa"/>
+              <w:bottom w:w="90" w:type="dxa"/>
+              <w:end w:w="110" w:type="dxa"/>
+            </w:tcMar>
           </w:tcPr>
           <w:p>
             <w:pPr>
@@ -394,11 +500,10 @@
             </w:pPr>
             <w:r>
               <w:rPr>
-                <w:rFonts w:ascii="Times New Roman" w:hAnsi="Times New Roman"/>
                 <w:b/>
-                <w:sz w:val="19"/>
+                <w:sz w:val="18"/>
               </w:rPr>
-              <w:t>Что оценивается</w:t>
+              <w:t>Операционное толкование</w:t>
             </w:r>
           </w:p>
         </w:tc>
@@ -406,8 +511,14 @@
       <w:tr>
         <w:tc>
           <w:tcPr>
-            <w:tcW w:type="dxa" w:w="680"/>
+            <w:tcW w:type="dxa" w:w="792"/>
             <w:vAlign w:val="center"/>
+            <w:tcMar>
+              <w:top w:w="90" w:type="dxa"/>
+              <w:start w:w="110" w:type="dxa"/>
+              <w:bottom w:w="90" w:type="dxa"/>
+              <w:end w:w="110" w:type="dxa"/>
+            </w:tcMar>
           </w:tcPr>
           <w:p>
             <w:pPr>
@@ -415,8 +526,7 @@
             </w:pPr>
             <w:r>
               <w:rPr>
-                <w:rFonts w:ascii="Times New Roman" w:hAnsi="Times New Roman"/>
-                <w:sz w:val="19"/>
+                <w:sz w:val="18"/>
               </w:rPr>
               <w:t>C1</w:t>
             </w:r>
@@ -424,8 +534,14 @@
         </w:tc>
         <w:tc>
           <w:tcPr>
-            <w:tcW w:type="dxa" w:w="2494"/>
+            <w:tcW w:type="dxa" w:w="2520"/>
             <w:vAlign w:val="center"/>
+            <w:tcMar>
+              <w:top w:w="90" w:type="dxa"/>
+              <w:start w:w="110" w:type="dxa"/>
+              <w:bottom w:w="90" w:type="dxa"/>
+              <w:end w:w="110" w:type="dxa"/>
+            </w:tcMar>
           </w:tcPr>
           <w:p>
             <w:pPr>
@@ -433,17 +549,22 @@
             </w:pPr>
             <w:r>
               <w:rPr>
-                <w:rFonts w:ascii="Times New Roman" w:hAnsi="Times New Roman"/>
-                <w:sz w:val="19"/>
+                <w:sz w:val="18"/>
               </w:rPr>
-              <w:t>Полезность</w:t>
+              <w:t>Полезность для целевых пользователей</w:t>
             </w:r>
           </w:p>
         </w:tc>
         <w:tc>
           <w:tcPr>
-            <w:tcW w:type="dxa" w:w="6350"/>
+            <w:tcW w:type="dxa" w:w="6552"/>
             <w:vAlign w:val="center"/>
+            <w:tcMar>
+              <w:top w:w="90" w:type="dxa"/>
+              <w:start w:w="110" w:type="dxa"/>
+              <w:bottom w:w="90" w:type="dxa"/>
+              <w:end w:w="110" w:type="dxa"/>
+            </w:tcMar>
           </w:tcPr>
           <w:p>
             <w:pPr>
@@ -451,10 +572,9 @@
             </w:pPr>
             <w:r>
               <w:rPr>
-                <w:rFonts w:ascii="Times New Roman" w:hAnsi="Times New Roman"/>
-                <w:sz w:val="19"/>
+                <w:sz w:val="18"/>
               </w:rPr>
-              <w:t>Насколько проект решает задачу пользователя</w:t>
+              <w:t>Насколько концепция решает заметную повседневную задачу. Больше — лучше.</w:t>
             </w:r>
           </w:p>
         </w:tc>
@@ -462,8 +582,14 @@
       <w:tr>
         <w:tc>
           <w:tcPr>
-            <w:tcW w:type="dxa" w:w="680"/>
+            <w:tcW w:type="dxa" w:w="792"/>
             <w:vAlign w:val="center"/>
+            <w:tcMar>
+              <w:top w:w="90" w:type="dxa"/>
+              <w:start w:w="110" w:type="dxa"/>
+              <w:bottom w:w="90" w:type="dxa"/>
+              <w:end w:w="110" w:type="dxa"/>
+            </w:tcMar>
           </w:tcPr>
           <w:p>
             <w:pPr>
@@ -471,8 +597,7 @@
             </w:pPr>
             <w:r>
               <w:rPr>
-                <w:rFonts w:ascii="Times New Roman" w:hAnsi="Times New Roman"/>
-                <w:sz w:val="19"/>
+                <w:sz w:val="18"/>
               </w:rPr>
               <w:t>C2</w:t>
             </w:r>
@@ -480,8 +605,14 @@
         </w:tc>
         <w:tc>
           <w:tcPr>
-            <w:tcW w:type="dxa" w:w="2494"/>
+            <w:tcW w:type="dxa" w:w="2520"/>
             <w:vAlign w:val="center"/>
+            <w:tcMar>
+              <w:top w:w="90" w:type="dxa"/>
+              <w:start w:w="110" w:type="dxa"/>
+              <w:bottom w:w="90" w:type="dxa"/>
+              <w:end w:w="110" w:type="dxa"/>
+            </w:tcMar>
           </w:tcPr>
           <w:p>
             <w:pPr>
@@ -489,17 +620,22 @@
             </w:pPr>
             <w:r>
               <w:rPr>
-                <w:rFonts w:ascii="Times New Roman" w:hAnsi="Times New Roman"/>
-                <w:sz w:val="19"/>
+                <w:sz w:val="18"/>
               </w:rPr>
-              <w:t>Реализуемость</w:t>
+              <w:t>Реализуемость MVP</w:t>
             </w:r>
           </w:p>
         </w:tc>
         <w:tc>
           <w:tcPr>
-            <w:tcW w:type="dxa" w:w="6350"/>
+            <w:tcW w:type="dxa" w:w="6552"/>
             <w:vAlign w:val="center"/>
+            <w:tcMar>
+              <w:top w:w="90" w:type="dxa"/>
+              <w:start w:w="110" w:type="dxa"/>
+              <w:bottom w:w="90" w:type="dxa"/>
+              <w:end w:w="110" w:type="dxa"/>
+            </w:tcMar>
           </w:tcPr>
           <w:p>
             <w:pPr>
@@ -507,10 +643,9 @@
             </w:pPr>
             <w:r>
               <w:rPr>
-                <w:rFonts w:ascii="Times New Roman" w:hAnsi="Times New Roman"/>
-                <w:sz w:val="19"/>
+                <w:sz w:val="18"/>
               </w:rPr>
-              <w:t>Можно ли сделать MVP небольшой командой</w:t>
+              <w:t>Насколько реально реализовать базовый продукт небольшой учебной командой. Больше — лучше.</w:t>
             </w:r>
           </w:p>
         </w:tc>
@@ -518,8 +653,14 @@
       <w:tr>
         <w:tc>
           <w:tcPr>
-            <w:tcW w:type="dxa" w:w="680"/>
+            <w:tcW w:type="dxa" w:w="792"/>
             <w:vAlign w:val="center"/>
+            <w:tcMar>
+              <w:top w:w="90" w:type="dxa"/>
+              <w:start w:w="110" w:type="dxa"/>
+              <w:bottom w:w="90" w:type="dxa"/>
+              <w:end w:w="110" w:type="dxa"/>
+            </w:tcMar>
           </w:tcPr>
           <w:p>
             <w:pPr>
@@ -527,8 +668,7 @@
             </w:pPr>
             <w:r>
               <w:rPr>
-                <w:rFonts w:ascii="Times New Roman" w:hAnsi="Times New Roman"/>
-                <w:sz w:val="19"/>
+                <w:sz w:val="18"/>
               </w:rPr>
               <w:t>C3</w:t>
             </w:r>
@@ -536,8 +676,14 @@
         </w:tc>
         <w:tc>
           <w:tcPr>
-            <w:tcW w:type="dxa" w:w="2494"/>
+            <w:tcW w:type="dxa" w:w="2520"/>
             <w:vAlign w:val="center"/>
+            <w:tcMar>
+              <w:top w:w="90" w:type="dxa"/>
+              <w:start w:w="110" w:type="dxa"/>
+              <w:bottom w:w="90" w:type="dxa"/>
+              <w:end w:w="110" w:type="dxa"/>
+            </w:tcMar>
           </w:tcPr>
           <w:p>
             <w:pPr>
@@ -545,17 +691,22 @@
             </w:pPr>
             <w:r>
               <w:rPr>
-                <w:rFonts w:ascii="Times New Roman" w:hAnsi="Times New Roman"/>
-                <w:sz w:val="19"/>
+                <w:sz w:val="18"/>
               </w:rPr>
-              <w:t>Ясность сценариев</w:t>
+              <w:t>Ясность границ и сценариев</w:t>
             </w:r>
           </w:p>
         </w:tc>
         <w:tc>
           <w:tcPr>
-            <w:tcW w:type="dxa" w:w="6350"/>
+            <w:tcW w:type="dxa" w:w="6552"/>
             <w:vAlign w:val="center"/>
+            <w:tcMar>
+              <w:top w:w="90" w:type="dxa"/>
+              <w:start w:w="110" w:type="dxa"/>
+              <w:bottom w:w="90" w:type="dxa"/>
+              <w:end w:w="110" w:type="dxa"/>
+            </w:tcMar>
           </w:tcPr>
           <w:p>
             <w:pPr>
@@ -563,10 +714,9 @@
             </w:pPr>
             <w:r>
               <w:rPr>
-                <w:rFonts w:ascii="Times New Roman" w:hAnsi="Times New Roman"/>
-                <w:sz w:val="19"/>
+                <w:sz w:val="18"/>
               </w:rPr>
-              <w:t>Можно ли выделить отдельные Use Cases</w:t>
+              <w:t>Насколько легко выделить 10–15 самостоятельных Use Cases и оценить их в Фазе 3. Больше — лучше.</w:t>
             </w:r>
           </w:p>
         </w:tc>
@@ -574,8 +724,14 @@
       <w:tr>
         <w:tc>
           <w:tcPr>
-            <w:tcW w:type="dxa" w:w="680"/>
+            <w:tcW w:type="dxa" w:w="792"/>
             <w:vAlign w:val="center"/>
+            <w:tcMar>
+              <w:top w:w="90" w:type="dxa"/>
+              <w:start w:w="110" w:type="dxa"/>
+              <w:bottom w:w="90" w:type="dxa"/>
+              <w:end w:w="110" w:type="dxa"/>
+            </w:tcMar>
           </w:tcPr>
           <w:p>
             <w:pPr>
@@ -583,8 +739,7 @@
             </w:pPr>
             <w:r>
               <w:rPr>
-                <w:rFonts w:ascii="Times New Roman" w:hAnsi="Times New Roman"/>
-                <w:sz w:val="19"/>
+                <w:sz w:val="18"/>
               </w:rPr>
               <w:t>C4</w:t>
             </w:r>
@@ -592,8 +747,14 @@
         </w:tc>
         <w:tc>
           <w:tcPr>
-            <w:tcW w:type="dxa" w:w="2494"/>
+            <w:tcW w:type="dxa" w:w="2520"/>
             <w:vAlign w:val="center"/>
+            <w:tcMar>
+              <w:top w:w="90" w:type="dxa"/>
+              <w:start w:w="110" w:type="dxa"/>
+              <w:bottom w:w="90" w:type="dxa"/>
+              <w:end w:w="110" w:type="dxa"/>
+            </w:tcMar>
           </w:tcPr>
           <w:p>
             <w:pPr>
@@ -601,17 +762,22 @@
             </w:pPr>
             <w:r>
               <w:rPr>
-                <w:rFonts w:ascii="Times New Roman" w:hAnsi="Times New Roman"/>
-                <w:sz w:val="19"/>
+                <w:sz w:val="18"/>
               </w:rPr>
-              <w:t>Планирование</w:t>
+              <w:t>Пригодность для планирования</w:t>
             </w:r>
           </w:p>
         </w:tc>
         <w:tc>
           <w:tcPr>
-            <w:tcW w:type="dxa" w:w="6350"/>
+            <w:tcW w:type="dxa" w:w="6552"/>
             <w:vAlign w:val="center"/>
+            <w:tcMar>
+              <w:top w:w="90" w:type="dxa"/>
+              <w:start w:w="110" w:type="dxa"/>
+              <w:bottom w:w="90" w:type="dxa"/>
+              <w:end w:w="110" w:type="dxa"/>
+            </w:tcMar>
           </w:tcPr>
           <w:p>
             <w:pPr>
@@ -619,23 +785,23 @@
             </w:pPr>
             <w:r>
               <w:rPr>
-                <w:rFonts w:ascii="Times New Roman" w:hAnsi="Times New Roman"/>
-                <w:sz w:val="19"/>
+                <w:sz w:val="18"/>
               </w:rPr>
-              <w:t>Можно ли разделить работу на задачи и роли</w:t>
+              <w:t>Насколько естественно разложить проект на 20–25 работ с зависимостями и разными ролями в Фазе 5. Больше — лучше.</w:t>
             </w:r>
           </w:p>
         </w:tc>
       </w:tr>
     </w:tbl>
+    <w:p/>
     <w:p>
-      <w:pPr>
-        <w:spacing w:after="0"/>
-      </w:pPr>
+      <w:r>
+        <w:t>Все критерии направлены в одну сторону: более высокая оценка предпочтительнее. Это упрощает нормировку в TOPSIS и не меняет смысл сравнения.</w:t>
+      </w:r>
     </w:p>
     <w:p>
       <w:r>
-        <w:t>Все критерии выгодные: более высокая оценка считается лучшей.</w:t>
+        <w:br w:type="page"/>
       </w:r>
     </w:p>
     <w:p>
@@ -643,22 +809,17 @@
         <w:pStyle w:val="Heading1"/>
       </w:pPr>
       <w:r>
-        <w:t>Оценки и расчёт</w:t>
+        <w:t>3 Исходные оценки</w:t>
       </w:r>
     </w:p>
     <w:p>
       <w:r>
-        <w:t>Исходные оценки и промежуточные формулы приведены в книге Excel. На отдельных листах показаны расчёты TOPSIS и МАИ.</w:t>
+        <w:t>Оценки важности критериев и альтернатив заданы по шкале 1–9. Для TOPSIS ожидаемое число дополнено осторожной и благоприятной границей: max(1, m−1) ≤ m ≤ min(9, m+1).</w:t>
       </w:r>
     </w:p>
     <w:p>
       <w:r>
-        <w:t>В TOPSIS оценки записаны тройками: осторожное, ожидаемое и благоприятное значения. После усреднения оценок и нормировки найдено расстояние каждой концепции до лучшего и худшего решений. Чем выше коэффициент близости CC = D− / (D+ + D−), тем выше место.</w:t>
-      </w:r>
-    </w:p>
-    <w:p>
-      <w:r>
-        <w:t>В МАИ составлены парные сравнения критериев и альтернатив. Мнения объединены геометрическим средним, после чего вычислены веса критериев и общий приоритет каждой концепции. Отношения согласованности CR для всех групповых матриц ниже 0,10.</w:t>
+        <w:t>Для МАИ построены парные сравнения по шкале Саати 1–9 и обратным значениям. Исходные числа и промежуточные расчёты приведены в книге «Фаза 1 Экспертные оценки.xlsx».</w:t>
       </w:r>
     </w:p>
     <w:p>
@@ -666,7 +827,56 @@
         <w:pStyle w:val="Heading1"/>
       </w:pPr>
       <w:r>
-        <w:t>Результат</w:t>
+        <w:t>4 Метод расчёта</w:t>
+      </w:r>
+    </w:p>
+    <w:p>
+      <w:pPr>
+        <w:pStyle w:val="Heading2"/>
+      </w:pPr>
+      <w:r>
+        <w:t>Нечёткий коллективный TOPSIS</w:t>
+      </w:r>
+    </w:p>
+    <w:p>
+      <w:r>
+        <w:t>Три числа каждой оценки образуют треугольное нечёткое число (l, m, u). По каждому элементу берётся покомпонентное среднее оценок экспертов. Оценки альтернатив нормируются по максимальной верхней границе соответствующего критерия. Веса критериев нормируются по сумме их верхних границ. Нормированные оценки покомпонентно умножаются на веса.</w:t>
+      </w:r>
+    </w:p>
+    <w:p>
+      <w:r>
+        <w:t>Для каждого критерия положительный идеал — покомпонентный максимум взвешенных оценок четырёх концепций, отрицательный — покомпонентный минимум. Расстояние между двумя тройками вычисляется как корень из среднего квадратов трёх разностей. Для каждой концепции суммируются расстояния до двух идеалов; коэффициент близости CC = D− / (D+ + D−). Предпочтителен наибольший CC. Все критерии являются выгодными.</w:t>
+      </w:r>
+    </w:p>
+    <w:p>
+      <w:pPr>
+        <w:pStyle w:val="Heading2"/>
+      </w:pPr>
+      <w:r>
+        <w:t>Чёткий коллективный МАИ</w:t>
+      </w:r>
+    </w:p>
+    <w:p>
+      <w:r>
+        <w:t>По таблицам оценок составляются взаимно обратные матрицы парных сравнений: одна 4 × 4 для критериев и четыре 4 × 4 для концепций по отдельным критериям. Групповая оценка каждой пары — геометрическое среднее четырёх значений. Вектор приоритетов каждой групповой матрицы находится методом геометрических средних строк и нормируется до суммы 1. Общий приоритет концепции — сумма её локальных приоритетов, умноженных на веса критериев.</w:t>
+      </w:r>
+    </w:p>
+    <w:p>
+      <w:r>
+        <w:t>Для каждой матрицы вычислена согласованность: λmax = среднее (Aw)i/wi, CI = (λmax−4)/3, CR = CI/0,90. Во всех пяти групповых матрицах CR меньше порогового значения 0,10. Максимальный общий приоритет определяет первое место по МАИ.</w:t>
+      </w:r>
+    </w:p>
+    <w:p>
+      <w:r>
+        <w:br w:type="page"/>
+      </w:r>
+    </w:p>
+    <w:p>
+      <w:pPr>
+        <w:pStyle w:val="Heading1"/>
+      </w:pPr>
+      <w:r>
+        <w:t>5 Результаты сравнения</w:t>
       </w:r>
     </w:p>
     <w:tbl>
@@ -677,16 +887,24 @@
         <w:tblLook w:firstColumn="1" w:firstRow="1" w:lastColumn="0" w:lastRow="0" w:noHBand="0" w:noVBand="1" w:val="04A0"/>
       </w:tblPr>
       <w:tblGrid>
-        <w:gridCol w:w="2381"/>
-        <w:gridCol w:w="2381"/>
-        <w:gridCol w:w="2381"/>
-        <w:gridCol w:w="2381"/>
+        <w:gridCol w:w="1987"/>
+        <w:gridCol w:w="1987"/>
+        <w:gridCol w:w="1987"/>
+        <w:gridCol w:w="1987"/>
+        <w:gridCol w:w="1987"/>
       </w:tblGrid>
       <w:tr>
         <w:tc>
           <w:tcPr>
-            <w:tcW w:type="dxa" w:w="5102"/>
+            <w:tcW w:type="dxa" w:w="3960"/>
+            <w:shd w:fill="E8EDF2"/>
             <w:vAlign w:val="center"/>
+            <w:tcMar>
+              <w:top w:w="90" w:type="dxa"/>
+              <w:start w:w="110" w:type="dxa"/>
+              <w:bottom w:w="90" w:type="dxa"/>
+              <w:end w:w="110" w:type="dxa"/>
+            </w:tcMar>
           </w:tcPr>
           <w:p>
             <w:pPr>
@@ -694,9 +912,8 @@
             </w:pPr>
             <w:r>
               <w:rPr>
-                <w:rFonts w:ascii="Times New Roman" w:hAnsi="Times New Roman"/>
                 <w:b/>
-                <w:sz w:val="19"/>
+                <w:sz w:val="18"/>
               </w:rPr>
               <w:t>Концепция</w:t>
             </w:r>
@@ -704,8 +921,15 @@
         </w:tc>
         <w:tc>
           <w:tcPr>
-            <w:tcW w:type="dxa" w:w="1531"/>
+            <w:tcW w:type="dxa" w:w="1440"/>
+            <w:shd w:fill="E8EDF2"/>
             <w:vAlign w:val="center"/>
+            <w:tcMar>
+              <w:top w:w="90" w:type="dxa"/>
+              <w:start w:w="110" w:type="dxa"/>
+              <w:bottom w:w="90" w:type="dxa"/>
+              <w:end w:w="110" w:type="dxa"/>
+            </w:tcMar>
           </w:tcPr>
           <w:p>
             <w:pPr>
@@ -713,18 +937,24 @@
             </w:pPr>
             <w:r>
               <w:rPr>
-                <w:rFonts w:ascii="Times New Roman" w:hAnsi="Times New Roman"/>
                 <w:b/>
-                <w:sz w:val="19"/>
+                <w:sz w:val="18"/>
               </w:rPr>
-              <w:t>TOPSIS: CC</w:t>
+              <w:t>CC TOPSIS</w:t>
             </w:r>
           </w:p>
         </w:tc>
         <w:tc>
           <w:tcPr>
-            <w:tcW w:type="dxa" w:w="1531"/>
+            <w:tcW w:type="dxa" w:w="1440"/>
+            <w:shd w:fill="E8EDF2"/>
             <w:vAlign w:val="center"/>
+            <w:tcMar>
+              <w:top w:w="90" w:type="dxa"/>
+              <w:start w:w="110" w:type="dxa"/>
+              <w:bottom w:w="90" w:type="dxa"/>
+              <w:end w:w="110" w:type="dxa"/>
+            </w:tcMar>
           </w:tcPr>
           <w:p>
             <w:pPr>
@@ -732,18 +962,24 @@
             </w:pPr>
             <w:r>
               <w:rPr>
-                <w:rFonts w:ascii="Times New Roman" w:hAnsi="Times New Roman"/>
                 <w:b/>
-                <w:sz w:val="19"/>
+                <w:sz w:val="18"/>
               </w:rPr>
-              <w:t>МАИ: вес</w:t>
+              <w:t>Место TOPSIS</w:t>
             </w:r>
           </w:p>
         </w:tc>
         <w:tc>
           <w:tcPr>
-            <w:tcW w:type="dxa" w:w="1361"/>
+            <w:tcW w:type="dxa" w:w="1584"/>
+            <w:shd w:fill="E8EDF2"/>
             <w:vAlign w:val="center"/>
+            <w:tcMar>
+              <w:top w:w="90" w:type="dxa"/>
+              <w:start w:w="110" w:type="dxa"/>
+              <w:bottom w:w="90" w:type="dxa"/>
+              <w:end w:w="110" w:type="dxa"/>
+            </w:tcMar>
           </w:tcPr>
           <w:p>
             <w:pPr>
@@ -751,11 +987,35 @@
             </w:pPr>
             <w:r>
               <w:rPr>
-                <w:rFonts w:ascii="Times New Roman" w:hAnsi="Times New Roman"/>
                 <w:b/>
-                <w:sz w:val="19"/>
+                <w:sz w:val="18"/>
               </w:rPr>
-              <w:t>Место</w:t>
+              <w:t>Приоритет МАИ</w:t>
+            </w:r>
+          </w:p>
+        </w:tc>
+        <w:tc>
+          <w:tcPr>
+            <w:tcW w:type="dxa" w:w="1440"/>
+            <w:shd w:fill="E8EDF2"/>
+            <w:vAlign w:val="center"/>
+            <w:tcMar>
+              <w:top w:w="90" w:type="dxa"/>
+              <w:start w:w="110" w:type="dxa"/>
+              <w:bottom w:w="90" w:type="dxa"/>
+              <w:end w:w="110" w:type="dxa"/>
+            </w:tcMar>
+          </w:tcPr>
+          <w:p>
+            <w:pPr>
+              <w:spacing w:after="0"/>
+            </w:pPr>
+            <w:r>
+              <w:rPr>
+                <w:b/>
+                <w:sz w:val="18"/>
+              </w:rPr>
+              <w:t>Место МАИ</w:t>
             </w:r>
           </w:p>
         </w:tc>
@@ -763,8 +1023,14 @@
       <w:tr>
         <w:tc>
           <w:tcPr>
-            <w:tcW w:type="dxa" w:w="5102"/>
+            <w:tcW w:type="dxa" w:w="3960"/>
             <w:vAlign w:val="center"/>
+            <w:tcMar>
+              <w:top w:w="90" w:type="dxa"/>
+              <w:start w:w="110" w:type="dxa"/>
+              <w:bottom w:w="90" w:type="dxa"/>
+              <w:end w:w="110" w:type="dxa"/>
+            </w:tcMar>
           </w:tcPr>
           <w:p>
             <w:pPr>
@@ -772,8 +1038,7 @@
             </w:pPr>
             <w:r>
               <w:rPr>
-                <w:rFonts w:ascii="Times New Roman" w:hAnsi="Times New Roman"/>
-                <w:sz w:val="19"/>
+                <w:sz w:val="18"/>
               </w:rPr>
               <w:t>A1 Бронирование учебных помещений</w:t>
             </w:r>
@@ -781,8 +1046,14 @@
         </w:tc>
         <w:tc>
           <w:tcPr>
-            <w:tcW w:type="dxa" w:w="1531"/>
+            <w:tcW w:type="dxa" w:w="1440"/>
             <w:vAlign w:val="center"/>
+            <w:tcMar>
+              <w:top w:w="90" w:type="dxa"/>
+              <w:start w:w="110" w:type="dxa"/>
+              <w:bottom w:w="90" w:type="dxa"/>
+              <w:end w:w="110" w:type="dxa"/>
+            </w:tcMar>
           </w:tcPr>
           <w:p>
             <w:pPr>
@@ -790,17 +1061,22 @@
             </w:pPr>
             <w:r>
               <w:rPr>
-                <w:rFonts w:ascii="Times New Roman" w:hAnsi="Times New Roman"/>
-                <w:sz w:val="19"/>
+                <w:sz w:val="18"/>
               </w:rPr>
-              <w:t>0,3160</w:t>
+              <w:t>0.3160</w:t>
             </w:r>
           </w:p>
         </w:tc>
         <w:tc>
           <w:tcPr>
-            <w:tcW w:type="dxa" w:w="1531"/>
+            <w:tcW w:type="dxa" w:w="1440"/>
             <w:vAlign w:val="center"/>
+            <w:tcMar>
+              <w:top w:w="90" w:type="dxa"/>
+              <w:start w:w="110" w:type="dxa"/>
+              <w:bottom w:w="90" w:type="dxa"/>
+              <w:end w:w="110" w:type="dxa"/>
+            </w:tcMar>
           </w:tcPr>
           <w:p>
             <w:pPr>
@@ -808,17 +1084,22 @@
             </w:pPr>
             <w:r>
               <w:rPr>
-                <w:rFonts w:ascii="Times New Roman" w:hAnsi="Times New Roman"/>
-                <w:sz w:val="19"/>
+                <w:sz w:val="18"/>
               </w:rPr>
-              <w:t>0,2094</w:t>
+              <w:t>4</w:t>
             </w:r>
           </w:p>
         </w:tc>
         <w:tc>
           <w:tcPr>
-            <w:tcW w:type="dxa" w:w="1361"/>
+            <w:tcW w:type="dxa" w:w="1584"/>
             <w:vAlign w:val="center"/>
+            <w:tcMar>
+              <w:top w:w="90" w:type="dxa"/>
+              <w:start w:w="110" w:type="dxa"/>
+              <w:bottom w:w="90" w:type="dxa"/>
+              <w:end w:w="110" w:type="dxa"/>
+            </w:tcMar>
           </w:tcPr>
           <w:p>
             <w:pPr>
@@ -826,8 +1107,30 @@
             </w:pPr>
             <w:r>
               <w:rPr>
-                <w:rFonts w:ascii="Times New Roman" w:hAnsi="Times New Roman"/>
-                <w:sz w:val="19"/>
+                <w:sz w:val="18"/>
+              </w:rPr>
+              <w:t>0.2094</w:t>
+            </w:r>
+          </w:p>
+        </w:tc>
+        <w:tc>
+          <w:tcPr>
+            <w:tcW w:type="dxa" w:w="1440"/>
+            <w:vAlign w:val="center"/>
+            <w:tcMar>
+              <w:top w:w="90" w:type="dxa"/>
+              <w:start w:w="110" w:type="dxa"/>
+              <w:bottom w:w="90" w:type="dxa"/>
+              <w:end w:w="110" w:type="dxa"/>
+            </w:tcMar>
+          </w:tcPr>
+          <w:p>
+            <w:pPr>
+              <w:spacing w:after="0"/>
+            </w:pPr>
+            <w:r>
+              <w:rPr>
+                <w:sz w:val="18"/>
               </w:rPr>
               <w:t>4</w:t>
             </w:r>
@@ -837,8 +1140,14 @@
       <w:tr>
         <w:tc>
           <w:tcPr>
-            <w:tcW w:type="dxa" w:w="5102"/>
+            <w:tcW w:type="dxa" w:w="3960"/>
             <w:vAlign w:val="center"/>
+            <w:tcMar>
+              <w:top w:w="90" w:type="dxa"/>
+              <w:start w:w="110" w:type="dxa"/>
+              <w:bottom w:w="90" w:type="dxa"/>
+              <w:end w:w="110" w:type="dxa"/>
+            </w:tcMar>
           </w:tcPr>
           <w:p>
             <w:pPr>
@@ -846,8 +1155,7 @@
             </w:pPr>
             <w:r>
               <w:rPr>
-                <w:rFonts w:ascii="Times New Roman" w:hAnsi="Times New Roman"/>
-                <w:sz w:val="19"/>
+                <w:sz w:val="18"/>
               </w:rPr>
               <w:t>A2 Планирование учебных групп</w:t>
             </w:r>
@@ -855,8 +1163,14 @@
         </w:tc>
         <w:tc>
           <w:tcPr>
-            <w:tcW w:type="dxa" w:w="1531"/>
+            <w:tcW w:type="dxa" w:w="1440"/>
             <w:vAlign w:val="center"/>
+            <w:tcMar>
+              <w:top w:w="90" w:type="dxa"/>
+              <w:start w:w="110" w:type="dxa"/>
+              <w:bottom w:w="90" w:type="dxa"/>
+              <w:end w:w="110" w:type="dxa"/>
+            </w:tcMar>
           </w:tcPr>
           <w:p>
             <w:pPr>
@@ -864,17 +1178,22 @@
             </w:pPr>
             <w:r>
               <w:rPr>
-                <w:rFonts w:ascii="Times New Roman" w:hAnsi="Times New Roman"/>
-                <w:sz w:val="19"/>
+                <w:sz w:val="18"/>
               </w:rPr>
-              <w:t>0,3987</w:t>
+              <w:t>0.3987</w:t>
             </w:r>
           </w:p>
         </w:tc>
         <w:tc>
           <w:tcPr>
-            <w:tcW w:type="dxa" w:w="1531"/>
+            <w:tcW w:type="dxa" w:w="1440"/>
             <w:vAlign w:val="center"/>
+            <w:tcMar>
+              <w:top w:w="90" w:type="dxa"/>
+              <w:start w:w="110" w:type="dxa"/>
+              <w:bottom w:w="90" w:type="dxa"/>
+              <w:end w:w="110" w:type="dxa"/>
+            </w:tcMar>
           </w:tcPr>
           <w:p>
             <w:pPr>
@@ -882,17 +1201,22 @@
             </w:pPr>
             <w:r>
               <w:rPr>
-                <w:rFonts w:ascii="Times New Roman" w:hAnsi="Times New Roman"/>
-                <w:sz w:val="19"/>
+                <w:sz w:val="18"/>
               </w:rPr>
-              <w:t>0,2278</w:t>
+              <w:t>3</w:t>
             </w:r>
           </w:p>
         </w:tc>
         <w:tc>
           <w:tcPr>
-            <w:tcW w:type="dxa" w:w="1361"/>
+            <w:tcW w:type="dxa" w:w="1584"/>
             <w:vAlign w:val="center"/>
+            <w:tcMar>
+              <w:top w:w="90" w:type="dxa"/>
+              <w:start w:w="110" w:type="dxa"/>
+              <w:bottom w:w="90" w:type="dxa"/>
+              <w:end w:w="110" w:type="dxa"/>
+            </w:tcMar>
           </w:tcPr>
           <w:p>
             <w:pPr>
@@ -900,8 +1224,30 @@
             </w:pPr>
             <w:r>
               <w:rPr>
-                <w:rFonts w:ascii="Times New Roman" w:hAnsi="Times New Roman"/>
-                <w:sz w:val="19"/>
+                <w:sz w:val="18"/>
+              </w:rPr>
+              <w:t>0.2278</w:t>
+            </w:r>
+          </w:p>
+        </w:tc>
+        <w:tc>
+          <w:tcPr>
+            <w:tcW w:type="dxa" w:w="1440"/>
+            <w:vAlign w:val="center"/>
+            <w:tcMar>
+              <w:top w:w="90" w:type="dxa"/>
+              <w:start w:w="110" w:type="dxa"/>
+              <w:bottom w:w="90" w:type="dxa"/>
+              <w:end w:w="110" w:type="dxa"/>
+            </w:tcMar>
+          </w:tcPr>
+          <w:p>
+            <w:pPr>
+              <w:spacing w:after="0"/>
+            </w:pPr>
+            <w:r>
+              <w:rPr>
+                <w:sz w:val="18"/>
               </w:rPr>
               <w:t>3</w:t>
             </w:r>
@@ -911,8 +1257,14 @@
       <w:tr>
         <w:tc>
           <w:tcPr>
-            <w:tcW w:type="dxa" w:w="5102"/>
+            <w:tcW w:type="dxa" w:w="3960"/>
             <w:vAlign w:val="center"/>
+            <w:tcMar>
+              <w:top w:w="90" w:type="dxa"/>
+              <w:start w:w="110" w:type="dxa"/>
+              <w:bottom w:w="90" w:type="dxa"/>
+              <w:end w:w="110" w:type="dxa"/>
+            </w:tcMar>
           </w:tcPr>
           <w:p>
             <w:pPr>
@@ -920,8 +1272,7 @@
             </w:pPr>
             <w:r>
               <w:rPr>
-                <w:rFonts w:ascii="Times New Roman" w:hAnsi="Times New Roman"/>
-                <w:sz w:val="19"/>
+                <w:sz w:val="18"/>
               </w:rPr>
               <w:t>A3 Регистрация на студенческие события</w:t>
             </w:r>
@@ -929,8 +1280,14 @@
         </w:tc>
         <w:tc>
           <w:tcPr>
-            <w:tcW w:type="dxa" w:w="1531"/>
+            <w:tcW w:type="dxa" w:w="1440"/>
             <w:vAlign w:val="center"/>
+            <w:tcMar>
+              <w:top w:w="90" w:type="dxa"/>
+              <w:start w:w="110" w:type="dxa"/>
+              <w:bottom w:w="90" w:type="dxa"/>
+              <w:end w:w="110" w:type="dxa"/>
+            </w:tcMar>
           </w:tcPr>
           <w:p>
             <w:pPr>
@@ -938,17 +1295,22 @@
             </w:pPr>
             <w:r>
               <w:rPr>
-                <w:rFonts w:ascii="Times New Roman" w:hAnsi="Times New Roman"/>
-                <w:sz w:val="19"/>
+                <w:sz w:val="18"/>
               </w:rPr>
-              <w:t>0,8228</w:t>
+              <w:t>0.8228</w:t>
             </w:r>
           </w:p>
         </w:tc>
         <w:tc>
           <w:tcPr>
-            <w:tcW w:type="dxa" w:w="1531"/>
+            <w:tcW w:type="dxa" w:w="1440"/>
             <w:vAlign w:val="center"/>
+            <w:tcMar>
+              <w:top w:w="90" w:type="dxa"/>
+              <w:start w:w="110" w:type="dxa"/>
+              <w:bottom w:w="90" w:type="dxa"/>
+              <w:end w:w="110" w:type="dxa"/>
+            </w:tcMar>
           </w:tcPr>
           <w:p>
             <w:pPr>
@@ -956,17 +1318,22 @@
             </w:pPr>
             <w:r>
               <w:rPr>
-                <w:rFonts w:ascii="Times New Roman" w:hAnsi="Times New Roman"/>
-                <w:sz w:val="19"/>
+                <w:sz w:val="18"/>
               </w:rPr>
-              <w:t>0,3012</w:t>
+              <w:t>1</w:t>
             </w:r>
           </w:p>
         </w:tc>
         <w:tc>
           <w:tcPr>
-            <w:tcW w:type="dxa" w:w="1361"/>
+            <w:tcW w:type="dxa" w:w="1584"/>
             <w:vAlign w:val="center"/>
+            <w:tcMar>
+              <w:top w:w="90" w:type="dxa"/>
+              <w:start w:w="110" w:type="dxa"/>
+              <w:bottom w:w="90" w:type="dxa"/>
+              <w:end w:w="110" w:type="dxa"/>
+            </w:tcMar>
           </w:tcPr>
           <w:p>
             <w:pPr>
@@ -974,8 +1341,30 @@
             </w:pPr>
             <w:r>
               <w:rPr>
-                <w:rFonts w:ascii="Times New Roman" w:hAnsi="Times New Roman"/>
-                <w:sz w:val="19"/>
+                <w:sz w:val="18"/>
+              </w:rPr>
+              <w:t>0.3012</w:t>
+            </w:r>
+          </w:p>
+        </w:tc>
+        <w:tc>
+          <w:tcPr>
+            <w:tcW w:type="dxa" w:w="1440"/>
+            <w:vAlign w:val="center"/>
+            <w:tcMar>
+              <w:top w:w="90" w:type="dxa"/>
+              <w:start w:w="110" w:type="dxa"/>
+              <w:bottom w:w="90" w:type="dxa"/>
+              <w:end w:w="110" w:type="dxa"/>
+            </w:tcMar>
+          </w:tcPr>
+          <w:p>
+            <w:pPr>
+              <w:spacing w:after="0"/>
+            </w:pPr>
+            <w:r>
+              <w:rPr>
+                <w:sz w:val="18"/>
               </w:rPr>
               <w:t>1</w:t>
             </w:r>
@@ -985,8 +1374,14 @@
       <w:tr>
         <w:tc>
           <w:tcPr>
-            <w:tcW w:type="dxa" w:w="5102"/>
+            <w:tcW w:type="dxa" w:w="3960"/>
             <w:vAlign w:val="center"/>
+            <w:tcMar>
+              <w:top w:w="90" w:type="dxa"/>
+              <w:start w:w="110" w:type="dxa"/>
+              <w:bottom w:w="90" w:type="dxa"/>
+              <w:end w:w="110" w:type="dxa"/>
+            </w:tcMar>
           </w:tcPr>
           <w:p>
             <w:pPr>
@@ -994,8 +1389,7 @@
             </w:pPr>
             <w:r>
               <w:rPr>
-                <w:rFonts w:ascii="Times New Roman" w:hAnsi="Times New Roman"/>
-                <w:sz w:val="19"/>
+                <w:sz w:val="18"/>
               </w:rPr>
               <w:t>A4 Расписание волонтёрских смен</w:t>
             </w:r>
@@ -1003,8 +1397,14 @@
         </w:tc>
         <w:tc>
           <w:tcPr>
-            <w:tcW w:type="dxa" w:w="1531"/>
+            <w:tcW w:type="dxa" w:w="1440"/>
             <w:vAlign w:val="center"/>
+            <w:tcMar>
+              <w:top w:w="90" w:type="dxa"/>
+              <w:start w:w="110" w:type="dxa"/>
+              <w:bottom w:w="90" w:type="dxa"/>
+              <w:end w:w="110" w:type="dxa"/>
+            </w:tcMar>
           </w:tcPr>
           <w:p>
             <w:pPr>
@@ -1012,17 +1412,22 @@
             </w:pPr>
             <w:r>
               <w:rPr>
-                <w:rFonts w:ascii="Times New Roman" w:hAnsi="Times New Roman"/>
-                <w:sz w:val="19"/>
+                <w:sz w:val="18"/>
               </w:rPr>
-              <w:t>0,5794</w:t>
+              <w:t>0.5794</w:t>
             </w:r>
           </w:p>
         </w:tc>
         <w:tc>
           <w:tcPr>
-            <w:tcW w:type="dxa" w:w="1531"/>
+            <w:tcW w:type="dxa" w:w="1440"/>
             <w:vAlign w:val="center"/>
+            <w:tcMar>
+              <w:top w:w="90" w:type="dxa"/>
+              <w:start w:w="110" w:type="dxa"/>
+              <w:bottom w:w="90" w:type="dxa"/>
+              <w:end w:w="110" w:type="dxa"/>
+            </w:tcMar>
           </w:tcPr>
           <w:p>
             <w:pPr>
@@ -1030,17 +1435,22 @@
             </w:pPr>
             <w:r>
               <w:rPr>
-                <w:rFonts w:ascii="Times New Roman" w:hAnsi="Times New Roman"/>
-                <w:sz w:val="19"/>
+                <w:sz w:val="18"/>
               </w:rPr>
-              <w:t>0,2616</w:t>
+              <w:t>2</w:t>
             </w:r>
           </w:p>
         </w:tc>
         <w:tc>
           <w:tcPr>
-            <w:tcW w:type="dxa" w:w="1361"/>
+            <w:tcW w:type="dxa" w:w="1584"/>
             <w:vAlign w:val="center"/>
+            <w:tcMar>
+              <w:top w:w="90" w:type="dxa"/>
+              <w:start w:w="110" w:type="dxa"/>
+              <w:bottom w:w="90" w:type="dxa"/>
+              <w:end w:w="110" w:type="dxa"/>
+            </w:tcMar>
           </w:tcPr>
           <w:p>
             <w:pPr>
@@ -1048,8 +1458,30 @@
             </w:pPr>
             <w:r>
               <w:rPr>
-                <w:rFonts w:ascii="Times New Roman" w:hAnsi="Times New Roman"/>
-                <w:sz w:val="19"/>
+                <w:sz w:val="18"/>
+              </w:rPr>
+              <w:t>0.2616</w:t>
+            </w:r>
+          </w:p>
+        </w:tc>
+        <w:tc>
+          <w:tcPr>
+            <w:tcW w:type="dxa" w:w="1440"/>
+            <w:vAlign w:val="center"/>
+            <w:tcMar>
+              <w:top w:w="90" w:type="dxa"/>
+              <w:start w:w="110" w:type="dxa"/>
+              <w:bottom w:w="90" w:type="dxa"/>
+              <w:end w:w="110" w:type="dxa"/>
+            </w:tcMar>
+          </w:tcPr>
+          <w:p>
+            <w:pPr>
+              <w:spacing w:after="0"/>
+            </w:pPr>
+            <w:r>
+              <w:rPr>
+                <w:sz w:val="18"/>
               </w:rPr>
               <w:t>2</w:t>
             </w:r>
@@ -1057,19 +1489,20 @@
         </w:tc>
       </w:tr>
     </w:tbl>
-    <w:p>
-      <w:pPr>
-        <w:spacing w:after="0"/>
-      </w:pPr>
-    </w:p>
+    <w:p/>
     <w:p>
       <w:r>
-        <w:t>Оба метода дали одинаковый порядок: A3, A4, A2, A1. Для дальнейшей работы выбрана A3 — регистрация на студенческие события.</w:t>
+        <w:t>По обоим методам первое место заняла A3 «Регистрация на студенческие события». TOPSIS: CC = 0,8228; МАИ: приоритет = 0,3012. Далее следуют A4, A2 и A1. У A3 высокий баланс по четырём критериям; A2 сильнее по реализуемости, A4 — по пригодности для планирования.</w:t>
       </w:r>
     </w:p>
     <w:p>
       <w:r>
-        <w:t>Задачи команды ведутся на отдельной доске YouGile: https://ru.yougile.com/board/nb0783gl8x30.</w:t>
+        <w:t>Согласованность групповых матриц МАИ: CR критериев = 0,0014; CR матриц альтернатив по C1–C4 = 0,0111; 0,0115; 0,0040; 0,0095. Все значения ниже порога 0,10.</w:t>
+      </w:r>
+    </w:p>
+    <w:p>
+      <w:r>
+        <w:t>Коэффициенты TOPSIS и приоритеты МАИ имеют разные шкалы и сопоставляются по порядку альтернатив, а не по абсолютной величине.</w:t>
       </w:r>
     </w:p>
     <w:p>
@@ -1077,27 +1510,40 @@
         <w:pStyle w:val="Heading1"/>
       </w:pPr>
       <w:r>
-        <w:t>Литература</w:t>
+        <w:t>6 Учёт работ</w:t>
       </w:r>
     </w:p>
     <w:p>
       <w:r>
-        <w:t>Chen C.-T. Extensions of the TOPSIS for group decision-making under fuzzy environment. Fuzzy Sets and Systems, 2000. DOI: 10.1016/S0165-0114(97)00377-1.</w:t>
-      </w:r>
-    </w:p>
-    <w:p>
-      <w:r>
-        <w:t>Ramanathan R., Ganesh L. S. Group preference aggregation methods employed in AHP. European Journal of Operational Research, 1994. DOI: 10.1016/0377-2217(94)90356-5.</w:t>
+        <w:t>Учёт задач, исполнителей, периодов и чистого времени работы вынесен на отдельную доску YouGile: https://ru.yougile.com/board/nb0783gl8x30. Материалы таск-трекера в данном репозитории не дублируются.</w:t>
       </w:r>
     </w:p>
     <w:sectPr>
-      <w:pgSz w:w="11906" w:h="16838"/>
-      <w:pgMar w:top="1134" w:right="1134" w:bottom="1134" w:left="1247" w:header="720" w:footer="720" w:gutter="0"/>
+      <w:footerReference w:type="default" r:id="rId9"/>
+      <w:pgSz w:w="12240" w:h="15840"/>
+      <w:pgMar w:top="1008" w:right="1152" w:bottom="936" w:left="1152" w:header="720" w:footer="720" w:gutter="0"/>
       <w:cols w:space="720"/>
       <w:docGrid w:linePitch="360"/>
     </w:sectPr>
   </w:body>
 </w:document>
+</file>
+
+<file path=word/footer1.xml><?xml version="1.0" encoding="utf-8"?>
+<w:ftr xmlns:m="http://schemas.openxmlformats.org/officeDocument/2006/math" xmlns:mc="http://schemas.openxmlformats.org/markup-compatibility/2006" xmlns:mo="http://schemas.microsoft.com/office/mac/office/2008/main" xmlns:mv="urn:schemas-microsoft-com:mac:vml" xmlns:o="urn:schemas-microsoft-com:office:office" xmlns:r="http://schemas.openxmlformats.org/officeDocument/2006/relationships" xmlns:v="urn:schemas-microsoft-com:vml" xmlns:w10="urn:schemas-microsoft-com:office:word" xmlns:w14="http://schemas.microsoft.com/office/word/2010/wordml" xmlns:w="http://schemas.openxmlformats.org/wordprocessingml/2006/main" xmlns:wne="http://schemas.microsoft.com/office/word/2006/wordml" xmlns:wp14="http://schemas.microsoft.com/office/word/2010/wordprocessingDrawing" xmlns:wp="http://schemas.openxmlformats.org/drawingml/2006/wordprocessingDrawing" xmlns:wpc="http://schemas.microsoft.com/office/word/2010/wordprocessingCanvas" xmlns:wpg="http://schemas.microsoft.com/office/word/2010/wordprocessingGroup" xmlns:wpi="http://schemas.microsoft.com/office/word/2010/wordprocessingInk" xmlns:wps="http://schemas.microsoft.com/office/word/2010/wordprocessingShape" mc:Ignorable="w14 wp14">
+  <w:p>
+    <w:pPr>
+      <w:pStyle w:val="Footer"/>
+      <w:jc w:val="right"/>
+    </w:pPr>
+    <w:r>
+      <w:rPr>
+        <w:sz w:val="16"/>
+      </w:rPr>
+      <w:t>Фаза 1 • Отчёт</w:t>
+    </w:r>
+  </w:p>
+</w:ftr>
 </file>
 
 <file path=word/numbering.xml><?xml version="1.0" encoding="utf-8"?>
@@ -1464,11 +1910,12 @@
     <w:qFormat/>
     <w:rsid w:val="00FC693F"/>
     <w:pPr>
-      <w:spacing w:after="100" w:line="259" w:lineRule="auto"/>
+      <w:spacing w:after="120"/>
     </w:pPr>
     <w:rPr>
-      <w:rFonts w:ascii="Times New Roman" w:hAnsi="Times New Roman"/>
-      <w:sz w:val="22"/>
+      <w:rFonts w:ascii="Aptos" w:hAnsi="Aptos"/>
+      <w:color w:val="000000"/>
+      <w:sz w:val="21"/>
     </w:rPr>
   </w:style>
   <w:style w:type="paragraph" w:styleId="Header">
@@ -1526,14 +1973,15 @@
     <w:pPr>
       <w:keepNext/>
       <w:keepLines/>
-      <w:spacing w:before="200" w:after="80"/>
+      <w:spacing w:before="160" w:after="100"/>
       <w:outlineLvl w:val="0"/>
     </w:pPr>
     <w:rPr>
-      <w:rFonts w:asciiTheme="majorHAnsi" w:eastAsiaTheme="majorEastAsia" w:hAnsiTheme="majorHAnsi" w:cstheme="majorBidi" w:ascii="Times New Roman" w:hAnsi="Times New Roman"/>
+      <w:rFonts w:asciiTheme="majorHAnsi" w:eastAsiaTheme="majorEastAsia" w:hAnsiTheme="majorHAnsi" w:cstheme="majorBidi" w:ascii="Aptos" w:hAnsi="Aptos"/>
       <w:b/>
       <w:bCs/>
-      <w:sz w:val="24"/>
+      <w:color w:val="000000"/>
+      <w:sz w:val="26"/>
       <w:szCs w:val="28"/>
     </w:rPr>
   </w:style>
@@ -1549,15 +1997,15 @@
     <w:pPr>
       <w:keepNext/>
       <w:keepLines/>
-      <w:spacing w:before="200" w:after="0"/>
+      <w:spacing w:before="120" w:after="100"/>
       <w:outlineLvl w:val="1"/>
     </w:pPr>
     <w:rPr>
-      <w:rFonts w:asciiTheme="majorHAnsi" w:eastAsiaTheme="majorEastAsia" w:hAnsiTheme="majorHAnsi" w:cstheme="majorBidi"/>
+      <w:rFonts w:asciiTheme="majorHAnsi" w:eastAsiaTheme="majorEastAsia" w:hAnsiTheme="majorHAnsi" w:cstheme="majorBidi" w:ascii="Aptos" w:hAnsi="Aptos"/>
       <w:b/>
       <w:bCs/>
-      <w:color w:val="4F81BD" w:themeColor="accent1"/>
-      <w:sz w:val="26"/>
+      <w:color w:val="000000"/>
+      <w:sz w:val="22"/>
       <w:szCs w:val="26"/>
     </w:rPr>
   </w:style>
@@ -1811,15 +2259,16 @@
     <w:qFormat/>
     <w:rsid w:val="00FC693F"/>
     <w:pPr>
-      <w:spacing w:after="80" w:line="240" w:lineRule="auto" w:before="200"/>
+      <w:spacing w:after="100" w:line="240" w:lineRule="auto" w:before="240"/>
       <w:contextualSpacing/>
     </w:pPr>
     <w:rPr>
-      <w:rFonts w:asciiTheme="majorHAnsi" w:eastAsiaTheme="majorEastAsia" w:hAnsiTheme="majorHAnsi" w:cstheme="majorBidi" w:ascii="Times New Roman" w:hAnsi="Times New Roman"/>
+      <w:rFonts w:asciiTheme="majorHAnsi" w:eastAsiaTheme="majorEastAsia" w:hAnsiTheme="majorHAnsi" w:cstheme="majorBidi" w:ascii="Aptos" w:hAnsi="Aptos"/>
       <w:b/>
+      <w:color w:val="000000"/>
       <w:spacing w:val="5"/>
       <w:kern w:val="28"/>
-      <w:sz w:val="28"/>
+      <w:sz w:val="36"/>
       <w:szCs w:val="52"/>
     </w:rPr>
   </w:style>
@@ -13148,6 +13597,13 @@
         <w:shd w:val="clear" w:color="auto" w:fill="FBCAA2" w:themeFill="accent6" w:themeFillTint="7F"/>
       </w:tcPr>
     </w:tblStylePr>
+  </w:style>
+  <w:style w:type="paragraph" w:customStyle="1" w:styleId="Small">
+    <w:name w:val="Small"/>
+    <w:rPr>
+      <w:rFonts w:ascii="Aptos" w:hAnsi="Aptos"/>
+      <w:sz w:val="18"/>
+    </w:rPr>
   </w:style>
 </w:styles>
 </file>

</xml_diff>